<commit_message>
docs: document Kafka local state values
</commit_message>
<xml_diff>
--- a/docs/PABridgeAgent_Kafka_Integration.docx
+++ b/docs/PABridgeAgent_Kafka_Integration.docx
@@ -1910,6 +1910,1815 @@
     </w:p>
     <w:p>
       <w:pPr>
+        <w:spacing w:after="100"/>
+      </w:pPr>
+      <w:r>
+        <w:t>#### localState 枚举值</w:t>
+      </w:r>
+    </w:p>
+    <w:tbl>
+      <w:tblPr>
+        <w:tblStyle w:val="TableGrid"/>
+        <w:tblW w:type="dxa" w:w="9360"/>
+        <w:jc w:val="left"/>
+        <w:tblLayout w:type="fixed"/>
+        <w:tblLook w:firstColumn="1" w:firstRow="1" w:lastColumn="0" w:lastRow="0" w:noHBand="0" w:noVBand="1" w:val="04A0"/>
+        <w:tblInd w:w="120" w:type="dxa"/>
+      </w:tblPr>
+      <w:tblGrid>
+        <w:gridCol w:w="2200"/>
+        <w:gridCol w:w="1800"/>
+        <w:gridCol w:w="5360"/>
+      </w:tblGrid>
+      <w:tr>
+        <w:tc>
+          <w:tcPr>
+            <w:tcW w:type="dxa" w:w="2200"/>
+            <w:tcMar>
+              <w:top w:w="80" w:type="dxa"/>
+              <w:start w:w="120" w:type="dxa"/>
+              <w:bottom w:w="80" w:type="dxa"/>
+              <w:end w:w="120" w:type="dxa"/>
+            </w:tcMar>
+            <w:vAlign w:val="center"/>
+            <w:shd w:fill="E8EEF5"/>
+          </w:tcPr>
+          <w:p>
+            <w:pPr>
+              <w:spacing w:after="0"/>
+            </w:pPr>
+            <w:r>
+              <w:rPr>
+                <w:b/>
+                <w:sz w:val="17"/>
+              </w:rPr>
+              <w:t>值</w:t>
+            </w:r>
+          </w:p>
+        </w:tc>
+        <w:tc>
+          <w:tcPr>
+            <w:tcW w:type="dxa" w:w="1800"/>
+            <w:tcMar>
+              <w:top w:w="80" w:type="dxa"/>
+              <w:start w:w="120" w:type="dxa"/>
+              <w:bottom w:w="80" w:type="dxa"/>
+              <w:end w:w="120" w:type="dxa"/>
+            </w:tcMar>
+            <w:vAlign w:val="center"/>
+            <w:shd w:fill="E8EEF5"/>
+          </w:tcPr>
+          <w:p>
+            <w:pPr>
+              <w:spacing w:after="0"/>
+            </w:pPr>
+            <w:r>
+              <w:rPr>
+                <w:b/>
+                <w:sz w:val="17"/>
+              </w:rPr>
+              <w:t>枚举名</w:t>
+            </w:r>
+          </w:p>
+        </w:tc>
+        <w:tc>
+          <w:tcPr>
+            <w:tcW w:type="dxa" w:w="5360"/>
+            <w:tcMar>
+              <w:top w:w="80" w:type="dxa"/>
+              <w:start w:w="120" w:type="dxa"/>
+              <w:bottom w:w="80" w:type="dxa"/>
+              <w:end w:w="120" w:type="dxa"/>
+            </w:tcMar>
+            <w:vAlign w:val="center"/>
+            <w:shd w:fill="E8EEF5"/>
+          </w:tcPr>
+          <w:p>
+            <w:pPr>
+              <w:spacing w:after="0"/>
+            </w:pPr>
+            <w:r>
+              <w:rPr>
+                <w:b/>
+                <w:sz w:val="17"/>
+              </w:rPr>
+              <w:t>含义</w:t>
+            </w:r>
+          </w:p>
+        </w:tc>
+      </w:tr>
+      <w:tr>
+        <w:tc>
+          <w:tcPr>
+            <w:tcW w:type="dxa" w:w="2200"/>
+            <w:tcMar>
+              <w:top w:w="80" w:type="dxa"/>
+              <w:start w:w="120" w:type="dxa"/>
+              <w:bottom w:w="80" w:type="dxa"/>
+              <w:end w:w="120" w:type="dxa"/>
+            </w:tcMar>
+            <w:vAlign w:val="center"/>
+          </w:tcPr>
+          <w:p>
+            <w:pPr>
+              <w:spacing w:after="0"/>
+            </w:pPr>
+            <w:r>
+              <w:rPr>
+                <w:sz w:val="17"/>
+              </w:rPr>
+              <w:t>0</w:t>
+            </w:r>
+          </w:p>
+        </w:tc>
+        <w:tc>
+          <w:tcPr>
+            <w:tcW w:type="dxa" w:w="1800"/>
+            <w:tcMar>
+              <w:top w:w="80" w:type="dxa"/>
+              <w:start w:w="120" w:type="dxa"/>
+              <w:bottom w:w="80" w:type="dxa"/>
+              <w:end w:w="120" w:type="dxa"/>
+            </w:tcMar>
+            <w:vAlign w:val="center"/>
+          </w:tcPr>
+          <w:p>
+            <w:pPr>
+              <w:spacing w:after="0"/>
+            </w:pPr>
+            <w:r>
+              <w:rPr>
+                <w:sz w:val="17"/>
+              </w:rPr>
+              <w:t>LOCAL_STATE_IN_PROGRESS</w:t>
+            </w:r>
+          </w:p>
+        </w:tc>
+        <w:tc>
+          <w:tcPr>
+            <w:tcW w:type="dxa" w:w="5360"/>
+            <w:tcMar>
+              <w:top w:w="80" w:type="dxa"/>
+              <w:start w:w="120" w:type="dxa"/>
+              <w:bottom w:w="80" w:type="dxa"/>
+              <w:end w:w="120" w:type="dxa"/>
+            </w:tcMar>
+            <w:vAlign w:val="center"/>
+          </w:tcPr>
+          <w:p>
+            <w:pPr>
+              <w:spacing w:after="0"/>
+            </w:pPr>
+            <w:r>
+              <w:rPr>
+                <w:sz w:val="17"/>
+              </w:rPr>
+              <w:t>广播进行中。</w:t>
+            </w:r>
+          </w:p>
+        </w:tc>
+      </w:tr>
+      <w:tr>
+        <w:tc>
+          <w:tcPr>
+            <w:tcW w:type="dxa" w:w="2200"/>
+            <w:tcMar>
+              <w:top w:w="80" w:type="dxa"/>
+              <w:start w:w="120" w:type="dxa"/>
+              <w:bottom w:w="80" w:type="dxa"/>
+              <w:end w:w="120" w:type="dxa"/>
+            </w:tcMar>
+            <w:vAlign w:val="center"/>
+          </w:tcPr>
+          <w:p>
+            <w:pPr>
+              <w:spacing w:after="0"/>
+            </w:pPr>
+            <w:r>
+              <w:rPr>
+                <w:sz w:val="17"/>
+              </w:rPr>
+              <w:t>1</w:t>
+            </w:r>
+          </w:p>
+        </w:tc>
+        <w:tc>
+          <w:tcPr>
+            <w:tcW w:type="dxa" w:w="1800"/>
+            <w:tcMar>
+              <w:top w:w="80" w:type="dxa"/>
+              <w:start w:w="120" w:type="dxa"/>
+              <w:bottom w:w="80" w:type="dxa"/>
+              <w:end w:w="120" w:type="dxa"/>
+            </w:tcMar>
+            <w:vAlign w:val="center"/>
+          </w:tcPr>
+          <w:p>
+            <w:pPr>
+              <w:spacing w:after="0"/>
+            </w:pPr>
+            <w:r>
+              <w:rPr>
+                <w:sz w:val="17"/>
+              </w:rPr>
+              <w:t>LOCAL_STATE_IN_PROGRESS_DWELL_TIME</w:t>
+            </w:r>
+          </w:p>
+        </w:tc>
+        <w:tc>
+          <w:tcPr>
+            <w:tcW w:type="dxa" w:w="5360"/>
+            <w:tcMar>
+              <w:top w:w="80" w:type="dxa"/>
+              <w:start w:w="120" w:type="dxa"/>
+              <w:bottom w:w="80" w:type="dxa"/>
+              <w:end w:w="120" w:type="dxa"/>
+            </w:tcMar>
+            <w:vAlign w:val="center"/>
+          </w:tcPr>
+          <w:p>
+            <w:pPr>
+              <w:spacing w:after="0"/>
+            </w:pPr>
+            <w:r>
+              <w:rPr>
+                <w:sz w:val="17"/>
+              </w:rPr>
+              <w:t>广播进行中，处于停留/间隔时间。</w:t>
+            </w:r>
+          </w:p>
+        </w:tc>
+      </w:tr>
+      <w:tr>
+        <w:tc>
+          <w:tcPr>
+            <w:tcW w:type="dxa" w:w="2200"/>
+            <w:tcMar>
+              <w:top w:w="80" w:type="dxa"/>
+              <w:start w:w="120" w:type="dxa"/>
+              <w:bottom w:w="80" w:type="dxa"/>
+              <w:end w:w="120" w:type="dxa"/>
+            </w:tcMar>
+            <w:vAlign w:val="center"/>
+          </w:tcPr>
+          <w:p>
+            <w:pPr>
+              <w:spacing w:after="0"/>
+            </w:pPr>
+            <w:r>
+              <w:rPr>
+                <w:sz w:val="17"/>
+              </w:rPr>
+              <w:t>2</w:t>
+            </w:r>
+          </w:p>
+        </w:tc>
+        <w:tc>
+          <w:tcPr>
+            <w:tcW w:type="dxa" w:w="1800"/>
+            <w:tcMar>
+              <w:top w:w="80" w:type="dxa"/>
+              <w:start w:w="120" w:type="dxa"/>
+              <w:bottom w:w="80" w:type="dxa"/>
+              <w:end w:w="120" w:type="dxa"/>
+            </w:tcMar>
+            <w:vAlign w:val="center"/>
+          </w:tcPr>
+          <w:p>
+            <w:pPr>
+              <w:spacing w:after="0"/>
+            </w:pPr>
+            <w:r>
+              <w:rPr>
+                <w:sz w:val="17"/>
+              </w:rPr>
+              <w:t>LOCAL_STATE_CONNECTING</w:t>
+            </w:r>
+          </w:p>
+        </w:tc>
+        <w:tc>
+          <w:tcPr>
+            <w:tcW w:type="dxa" w:w="5360"/>
+            <w:tcMar>
+              <w:top w:w="80" w:type="dxa"/>
+              <w:start w:w="120" w:type="dxa"/>
+              <w:bottom w:w="80" w:type="dxa"/>
+              <w:end w:w="120" w:type="dxa"/>
+            </w:tcMar>
+            <w:vAlign w:val="center"/>
+          </w:tcPr>
+          <w:p>
+            <w:pPr>
+              <w:spacing w:after="0"/>
+            </w:pPr>
+            <w:r>
+              <w:rPr>
+                <w:sz w:val="17"/>
+              </w:rPr>
+              <w:t>正在连接列车。</w:t>
+            </w:r>
+          </w:p>
+        </w:tc>
+      </w:tr>
+      <w:tr>
+        <w:tc>
+          <w:tcPr>
+            <w:tcW w:type="dxa" w:w="2200"/>
+            <w:tcMar>
+              <w:top w:w="80" w:type="dxa"/>
+              <w:start w:w="120" w:type="dxa"/>
+              <w:bottom w:w="80" w:type="dxa"/>
+              <w:end w:w="120" w:type="dxa"/>
+            </w:tcMar>
+            <w:vAlign w:val="center"/>
+          </w:tcPr>
+          <w:p>
+            <w:pPr>
+              <w:spacing w:after="0"/>
+            </w:pPr>
+            <w:r>
+              <w:rPr>
+                <w:sz w:val="17"/>
+              </w:rPr>
+              <w:t>3</w:t>
+            </w:r>
+          </w:p>
+        </w:tc>
+        <w:tc>
+          <w:tcPr>
+            <w:tcW w:type="dxa" w:w="1800"/>
+            <w:tcMar>
+              <w:top w:w="80" w:type="dxa"/>
+              <w:start w:w="120" w:type="dxa"/>
+              <w:bottom w:w="80" w:type="dxa"/>
+              <w:end w:w="120" w:type="dxa"/>
+            </w:tcMar>
+            <w:vAlign w:val="center"/>
+          </w:tcPr>
+          <w:p>
+            <w:pPr>
+              <w:spacing w:after="0"/>
+            </w:pPr>
+            <w:r>
+              <w:rPr>
+                <w:sz w:val="17"/>
+              </w:rPr>
+              <w:t>LOCAL_STATE_TRAIN_READY</w:t>
+            </w:r>
+          </w:p>
+        </w:tc>
+        <w:tc>
+          <w:tcPr>
+            <w:tcW w:type="dxa" w:w="5360"/>
+            <w:tcMar>
+              <w:top w:w="80" w:type="dxa"/>
+              <w:start w:w="120" w:type="dxa"/>
+              <w:bottom w:w="80" w:type="dxa"/>
+              <w:end w:w="120" w:type="dxa"/>
+            </w:tcMar>
+            <w:vAlign w:val="center"/>
+          </w:tcPr>
+          <w:p>
+            <w:pPr>
+              <w:spacing w:after="0"/>
+            </w:pPr>
+            <w:r>
+              <w:rPr>
+                <w:sz w:val="17"/>
+              </w:rPr>
+              <w:t>列车已就绪。</w:t>
+            </w:r>
+          </w:p>
+        </w:tc>
+      </w:tr>
+      <w:tr>
+        <w:tc>
+          <w:tcPr>
+            <w:tcW w:type="dxa" w:w="2200"/>
+            <w:tcMar>
+              <w:top w:w="80" w:type="dxa"/>
+              <w:start w:w="120" w:type="dxa"/>
+              <w:bottom w:w="80" w:type="dxa"/>
+              <w:end w:w="120" w:type="dxa"/>
+            </w:tcMar>
+            <w:vAlign w:val="center"/>
+          </w:tcPr>
+          <w:p>
+            <w:pPr>
+              <w:spacing w:after="0"/>
+            </w:pPr>
+            <w:r>
+              <w:rPr>
+                <w:sz w:val="17"/>
+              </w:rPr>
+              <w:t>4</w:t>
+            </w:r>
+          </w:p>
+        </w:tc>
+        <w:tc>
+          <w:tcPr>
+            <w:tcW w:type="dxa" w:w="1800"/>
+            <w:tcMar>
+              <w:top w:w="80" w:type="dxa"/>
+              <w:start w:w="120" w:type="dxa"/>
+              <w:bottom w:w="80" w:type="dxa"/>
+              <w:end w:w="120" w:type="dxa"/>
+            </w:tcMar>
+            <w:vAlign w:val="center"/>
+          </w:tcPr>
+          <w:p>
+            <w:pPr>
+              <w:spacing w:after="0"/>
+            </w:pPr>
+            <w:r>
+              <w:rPr>
+                <w:sz w:val="17"/>
+              </w:rPr>
+              <w:t>LOCAL_STATE_CONTINUE_LIVE_ANNOUNCEMENT_REQUIRED</w:t>
+            </w:r>
+          </w:p>
+        </w:tc>
+        <w:tc>
+          <w:tcPr>
+            <w:tcW w:type="dxa" w:w="5360"/>
+            <w:tcMar>
+              <w:top w:w="80" w:type="dxa"/>
+              <w:start w:w="120" w:type="dxa"/>
+              <w:bottom w:w="80" w:type="dxa"/>
+              <w:end w:w="120" w:type="dxa"/>
+            </w:tcMar>
+            <w:vAlign w:val="center"/>
+          </w:tcPr>
+          <w:p>
+            <w:pPr>
+              <w:spacing w:after="0"/>
+            </w:pPr>
+            <w:r>
+              <w:rPr>
+                <w:sz w:val="17"/>
+              </w:rPr>
+              <w:t>需要继续实时广播。</w:t>
+            </w:r>
+          </w:p>
+        </w:tc>
+      </w:tr>
+      <w:tr>
+        <w:tc>
+          <w:tcPr>
+            <w:tcW w:type="dxa" w:w="2200"/>
+            <w:tcMar>
+              <w:top w:w="80" w:type="dxa"/>
+              <w:start w:w="120" w:type="dxa"/>
+              <w:bottom w:w="80" w:type="dxa"/>
+              <w:end w:w="120" w:type="dxa"/>
+            </w:tcMar>
+            <w:vAlign w:val="center"/>
+          </w:tcPr>
+          <w:p>
+            <w:pPr>
+              <w:spacing w:after="0"/>
+            </w:pPr>
+            <w:r>
+              <w:rPr>
+                <w:sz w:val="17"/>
+              </w:rPr>
+              <w:t>5</w:t>
+            </w:r>
+          </w:p>
+        </w:tc>
+        <w:tc>
+          <w:tcPr>
+            <w:tcW w:type="dxa" w:w="1800"/>
+            <w:tcMar>
+              <w:top w:w="80" w:type="dxa"/>
+              <w:start w:w="120" w:type="dxa"/>
+              <w:bottom w:w="80" w:type="dxa"/>
+              <w:end w:w="120" w:type="dxa"/>
+            </w:tcMar>
+            <w:vAlign w:val="center"/>
+          </w:tcPr>
+          <w:p>
+            <w:pPr>
+              <w:spacing w:after="0"/>
+            </w:pPr>
+            <w:r>
+              <w:rPr>
+                <w:sz w:val="17"/>
+              </w:rPr>
+              <w:t>LOCAL_STATE_COMPLETED</w:t>
+            </w:r>
+          </w:p>
+        </w:tc>
+        <w:tc>
+          <w:tcPr>
+            <w:tcW w:type="dxa" w:w="5360"/>
+            <w:tcMar>
+              <w:top w:w="80" w:type="dxa"/>
+              <w:start w:w="120" w:type="dxa"/>
+              <w:bottom w:w="80" w:type="dxa"/>
+              <w:end w:w="120" w:type="dxa"/>
+            </w:tcMar>
+            <w:vAlign w:val="center"/>
+          </w:tcPr>
+          <w:p>
+            <w:pPr>
+              <w:spacing w:after="0"/>
+            </w:pPr>
+            <w:r>
+              <w:rPr>
+                <w:sz w:val="17"/>
+              </w:rPr>
+              <w:t>已完成。</w:t>
+            </w:r>
+          </w:p>
+        </w:tc>
+      </w:tr>
+      <w:tr>
+        <w:tc>
+          <w:tcPr>
+            <w:tcW w:type="dxa" w:w="2200"/>
+            <w:tcMar>
+              <w:top w:w="80" w:type="dxa"/>
+              <w:start w:w="120" w:type="dxa"/>
+              <w:bottom w:w="80" w:type="dxa"/>
+              <w:end w:w="120" w:type="dxa"/>
+            </w:tcMar>
+            <w:vAlign w:val="center"/>
+          </w:tcPr>
+          <w:p>
+            <w:pPr>
+              <w:spacing w:after="0"/>
+            </w:pPr>
+            <w:r>
+              <w:rPr>
+                <w:sz w:val="17"/>
+              </w:rPr>
+              <w:t>6</w:t>
+            </w:r>
+          </w:p>
+        </w:tc>
+        <w:tc>
+          <w:tcPr>
+            <w:tcW w:type="dxa" w:w="1800"/>
+            <w:tcMar>
+              <w:top w:w="80" w:type="dxa"/>
+              <w:start w:w="120" w:type="dxa"/>
+              <w:bottom w:w="80" w:type="dxa"/>
+              <w:end w:w="120" w:type="dxa"/>
+            </w:tcMar>
+            <w:vAlign w:val="center"/>
+          </w:tcPr>
+          <w:p>
+            <w:pPr>
+              <w:spacing w:after="0"/>
+            </w:pPr>
+            <w:r>
+              <w:rPr>
+                <w:sz w:val="17"/>
+              </w:rPr>
+              <w:t>LOCAL_STATE_ABORTED</w:t>
+            </w:r>
+          </w:p>
+        </w:tc>
+        <w:tc>
+          <w:tcPr>
+            <w:tcW w:type="dxa" w:w="5360"/>
+            <w:tcMar>
+              <w:top w:w="80" w:type="dxa"/>
+              <w:start w:w="120" w:type="dxa"/>
+              <w:bottom w:w="80" w:type="dxa"/>
+              <w:end w:w="120" w:type="dxa"/>
+            </w:tcMar>
+            <w:vAlign w:val="center"/>
+          </w:tcPr>
+          <w:p>
+            <w:pPr>
+              <w:spacing w:after="0"/>
+            </w:pPr>
+            <w:r>
+              <w:rPr>
+                <w:sz w:val="17"/>
+              </w:rPr>
+              <w:t>已中止。</w:t>
+            </w:r>
+          </w:p>
+        </w:tc>
+      </w:tr>
+      <w:tr>
+        <w:tc>
+          <w:tcPr>
+            <w:tcW w:type="dxa" w:w="2200"/>
+            <w:tcMar>
+              <w:top w:w="80" w:type="dxa"/>
+              <w:start w:w="120" w:type="dxa"/>
+              <w:bottom w:w="80" w:type="dxa"/>
+              <w:end w:w="120" w:type="dxa"/>
+            </w:tcMar>
+            <w:vAlign w:val="center"/>
+          </w:tcPr>
+          <w:p>
+            <w:pPr>
+              <w:spacing w:after="0"/>
+            </w:pPr>
+            <w:r>
+              <w:rPr>
+                <w:sz w:val="17"/>
+              </w:rPr>
+              <w:t>7</w:t>
+            </w:r>
+          </w:p>
+        </w:tc>
+        <w:tc>
+          <w:tcPr>
+            <w:tcW w:type="dxa" w:w="1800"/>
+            <w:tcMar>
+              <w:top w:w="80" w:type="dxa"/>
+              <w:start w:w="120" w:type="dxa"/>
+              <w:bottom w:w="80" w:type="dxa"/>
+              <w:end w:w="120" w:type="dxa"/>
+            </w:tcMar>
+            <w:vAlign w:val="center"/>
+          </w:tcPr>
+          <w:p>
+            <w:pPr>
+              <w:spacing w:after="0"/>
+            </w:pPr>
+            <w:r>
+              <w:rPr>
+                <w:sz w:val="17"/>
+              </w:rPr>
+              <w:t>LOCAL_STATE_FAILED_CYCLE</w:t>
+            </w:r>
+          </w:p>
+        </w:tc>
+        <w:tc>
+          <w:tcPr>
+            <w:tcW w:type="dxa" w:w="5360"/>
+            <w:tcMar>
+              <w:top w:w="80" w:type="dxa"/>
+              <w:start w:w="120" w:type="dxa"/>
+              <w:bottom w:w="80" w:type="dxa"/>
+              <w:end w:w="120" w:type="dxa"/>
+            </w:tcMar>
+            <w:vAlign w:val="center"/>
+          </w:tcPr>
+          <w:p>
+            <w:pPr>
+              <w:spacing w:after="0"/>
+            </w:pPr>
+            <w:r>
+              <w:rPr>
+                <w:sz w:val="17"/>
+              </w:rPr>
+              <w:t>广播循环失败。</w:t>
+            </w:r>
+          </w:p>
+        </w:tc>
+      </w:tr>
+      <w:tr>
+        <w:tc>
+          <w:tcPr>
+            <w:tcW w:type="dxa" w:w="2200"/>
+            <w:tcMar>
+              <w:top w:w="80" w:type="dxa"/>
+              <w:start w:w="120" w:type="dxa"/>
+              <w:bottom w:w="80" w:type="dxa"/>
+              <w:end w:w="120" w:type="dxa"/>
+            </w:tcMar>
+            <w:vAlign w:val="center"/>
+          </w:tcPr>
+          <w:p>
+            <w:pPr>
+              <w:spacing w:after="0"/>
+            </w:pPr>
+            <w:r>
+              <w:rPr>
+                <w:sz w:val="17"/>
+              </w:rPr>
+              <w:t>8</w:t>
+            </w:r>
+          </w:p>
+        </w:tc>
+        <w:tc>
+          <w:tcPr>
+            <w:tcW w:type="dxa" w:w="1800"/>
+            <w:tcMar>
+              <w:top w:w="80" w:type="dxa"/>
+              <w:start w:w="120" w:type="dxa"/>
+              <w:bottom w:w="80" w:type="dxa"/>
+              <w:end w:w="120" w:type="dxa"/>
+            </w:tcMar>
+            <w:vAlign w:val="center"/>
+          </w:tcPr>
+          <w:p>
+            <w:pPr>
+              <w:spacing w:after="0"/>
+            </w:pPr>
+            <w:r>
+              <w:rPr>
+                <w:sz w:val="17"/>
+              </w:rPr>
+              <w:t>LOCAL_STATE_FAILED_ZONE</w:t>
+            </w:r>
+          </w:p>
+        </w:tc>
+        <w:tc>
+          <w:tcPr>
+            <w:tcW w:type="dxa" w:w="5360"/>
+            <w:tcMar>
+              <w:top w:w="80" w:type="dxa"/>
+              <w:start w:w="120" w:type="dxa"/>
+              <w:bottom w:w="80" w:type="dxa"/>
+              <w:end w:w="120" w:type="dxa"/>
+            </w:tcMar>
+            <w:vAlign w:val="center"/>
+          </w:tcPr>
+          <w:p>
+            <w:pPr>
+              <w:spacing w:after="0"/>
+            </w:pPr>
+            <w:r>
+              <w:rPr>
+                <w:sz w:val="17"/>
+              </w:rPr>
+              <w:t>Zone 故障。</w:t>
+            </w:r>
+          </w:p>
+        </w:tc>
+      </w:tr>
+      <w:tr>
+        <w:tc>
+          <w:tcPr>
+            <w:tcW w:type="dxa" w:w="2200"/>
+            <w:tcMar>
+              <w:top w:w="80" w:type="dxa"/>
+              <w:start w:w="120" w:type="dxa"/>
+              <w:bottom w:w="80" w:type="dxa"/>
+              <w:end w:w="120" w:type="dxa"/>
+            </w:tcMar>
+            <w:vAlign w:val="center"/>
+          </w:tcPr>
+          <w:p>
+            <w:pPr>
+              <w:spacing w:after="0"/>
+            </w:pPr>
+            <w:r>
+              <w:rPr>
+                <w:sz w:val="17"/>
+              </w:rPr>
+              <w:t>9</w:t>
+            </w:r>
+          </w:p>
+        </w:tc>
+        <w:tc>
+          <w:tcPr>
+            <w:tcW w:type="dxa" w:w="1800"/>
+            <w:tcMar>
+              <w:top w:w="80" w:type="dxa"/>
+              <w:start w:w="120" w:type="dxa"/>
+              <w:bottom w:w="80" w:type="dxa"/>
+              <w:end w:w="120" w:type="dxa"/>
+            </w:tcMar>
+            <w:vAlign w:val="center"/>
+          </w:tcPr>
+          <w:p>
+            <w:pPr>
+              <w:spacing w:after="0"/>
+            </w:pPr>
+            <w:r>
+              <w:rPr>
+                <w:sz w:val="17"/>
+              </w:rPr>
+              <w:t>LOCAL_STATE_FAILED_OVERRIDDEN</w:t>
+            </w:r>
+          </w:p>
+        </w:tc>
+        <w:tc>
+          <w:tcPr>
+            <w:tcW w:type="dxa" w:w="5360"/>
+            <w:tcMar>
+              <w:top w:w="80" w:type="dxa"/>
+              <w:start w:w="120" w:type="dxa"/>
+              <w:bottom w:w="80" w:type="dxa"/>
+              <w:end w:w="120" w:type="dxa"/>
+            </w:tcMar>
+            <w:vAlign w:val="center"/>
+          </w:tcPr>
+          <w:p>
+            <w:pPr>
+              <w:spacing w:after="0"/>
+            </w:pPr>
+            <w:r>
+              <w:rPr>
+                <w:sz w:val="17"/>
+              </w:rPr>
+              <w:t>被更高优先级来源覆盖。</w:t>
+            </w:r>
+          </w:p>
+        </w:tc>
+      </w:tr>
+      <w:tr>
+        <w:tc>
+          <w:tcPr>
+            <w:tcW w:type="dxa" w:w="2200"/>
+            <w:tcMar>
+              <w:top w:w="80" w:type="dxa"/>
+              <w:start w:w="120" w:type="dxa"/>
+              <w:bottom w:w="80" w:type="dxa"/>
+              <w:end w:w="120" w:type="dxa"/>
+            </w:tcMar>
+            <w:vAlign w:val="center"/>
+          </w:tcPr>
+          <w:p>
+            <w:pPr>
+              <w:spacing w:after="0"/>
+            </w:pPr>
+            <w:r>
+              <w:rPr>
+                <w:sz w:val="17"/>
+              </w:rPr>
+              <w:t>10</w:t>
+            </w:r>
+          </w:p>
+        </w:tc>
+        <w:tc>
+          <w:tcPr>
+            <w:tcW w:type="dxa" w:w="1800"/>
+            <w:tcMar>
+              <w:top w:w="80" w:type="dxa"/>
+              <w:start w:w="120" w:type="dxa"/>
+              <w:bottom w:w="80" w:type="dxa"/>
+              <w:end w:w="120" w:type="dxa"/>
+            </w:tcMar>
+            <w:vAlign w:val="center"/>
+          </w:tcPr>
+          <w:p>
+            <w:pPr>
+              <w:spacing w:after="0"/>
+            </w:pPr>
+            <w:r>
+              <w:rPr>
+                <w:sz w:val="17"/>
+              </w:rPr>
+              <w:t>LOCAL_STATE_FAILED_TRAIN</w:t>
+            </w:r>
+          </w:p>
+        </w:tc>
+        <w:tc>
+          <w:tcPr>
+            <w:tcW w:type="dxa" w:w="5360"/>
+            <w:tcMar>
+              <w:top w:w="80" w:type="dxa"/>
+              <w:start w:w="120" w:type="dxa"/>
+              <w:bottom w:w="80" w:type="dxa"/>
+              <w:end w:w="120" w:type="dxa"/>
+            </w:tcMar>
+            <w:vAlign w:val="center"/>
+          </w:tcPr>
+          <w:p>
+            <w:pPr>
+              <w:spacing w:after="0"/>
+            </w:pPr>
+            <w:r>
+              <w:rPr>
+                <w:sz w:val="17"/>
+              </w:rPr>
+              <w:t>列车侧失败。</w:t>
+            </w:r>
+          </w:p>
+        </w:tc>
+      </w:tr>
+      <w:tr>
+        <w:tc>
+          <w:tcPr>
+            <w:tcW w:type="dxa" w:w="2200"/>
+            <w:tcMar>
+              <w:top w:w="80" w:type="dxa"/>
+              <w:start w:w="120" w:type="dxa"/>
+              <w:bottom w:w="80" w:type="dxa"/>
+              <w:end w:w="120" w:type="dxa"/>
+            </w:tcMar>
+            <w:vAlign w:val="center"/>
+          </w:tcPr>
+          <w:p>
+            <w:pPr>
+              <w:spacing w:after="0"/>
+            </w:pPr>
+            <w:r>
+              <w:rPr>
+                <w:sz w:val="17"/>
+              </w:rPr>
+              <w:t>11</w:t>
+            </w:r>
+          </w:p>
+        </w:tc>
+        <w:tc>
+          <w:tcPr>
+            <w:tcW w:type="dxa" w:w="1800"/>
+            <w:tcMar>
+              <w:top w:w="80" w:type="dxa"/>
+              <w:start w:w="120" w:type="dxa"/>
+              <w:bottom w:w="80" w:type="dxa"/>
+              <w:end w:w="120" w:type="dxa"/>
+            </w:tcMar>
+            <w:vAlign w:val="center"/>
+          </w:tcPr>
+          <w:p>
+            <w:pPr>
+              <w:spacing w:after="0"/>
+            </w:pPr>
+            <w:r>
+              <w:rPr>
+                <w:sz w:val="17"/>
+              </w:rPr>
+              <w:t>LOCAL_STATE_FAILED_CONNECTION_RESET</w:t>
+            </w:r>
+          </w:p>
+        </w:tc>
+        <w:tc>
+          <w:tcPr>
+            <w:tcW w:type="dxa" w:w="5360"/>
+            <w:tcMar>
+              <w:top w:w="80" w:type="dxa"/>
+              <w:start w:w="120" w:type="dxa"/>
+              <w:bottom w:w="80" w:type="dxa"/>
+              <w:end w:w="120" w:type="dxa"/>
+            </w:tcMar>
+            <w:vAlign w:val="center"/>
+          </w:tcPr>
+          <w:p>
+            <w:pPr>
+              <w:spacing w:after="0"/>
+            </w:pPr>
+            <w:r>
+              <w:rPr>
+                <w:sz w:val="17"/>
+              </w:rPr>
+              <w:t>连接被重置。</w:t>
+            </w:r>
+          </w:p>
+        </w:tc>
+      </w:tr>
+      <w:tr>
+        <w:tc>
+          <w:tcPr>
+            <w:tcW w:type="dxa" w:w="2200"/>
+            <w:tcMar>
+              <w:top w:w="80" w:type="dxa"/>
+              <w:start w:w="120" w:type="dxa"/>
+              <w:bottom w:w="80" w:type="dxa"/>
+              <w:end w:w="120" w:type="dxa"/>
+            </w:tcMar>
+            <w:vAlign w:val="center"/>
+          </w:tcPr>
+          <w:p>
+            <w:pPr>
+              <w:spacing w:after="0"/>
+            </w:pPr>
+            <w:r>
+              <w:rPr>
+                <w:sz w:val="17"/>
+              </w:rPr>
+              <w:t>12</w:t>
+            </w:r>
+          </w:p>
+        </w:tc>
+        <w:tc>
+          <w:tcPr>
+            <w:tcW w:type="dxa" w:w="1800"/>
+            <w:tcMar>
+              <w:top w:w="80" w:type="dxa"/>
+              <w:start w:w="120" w:type="dxa"/>
+              <w:bottom w:w="80" w:type="dxa"/>
+              <w:end w:w="120" w:type="dxa"/>
+            </w:tcMar>
+            <w:vAlign w:val="center"/>
+          </w:tcPr>
+          <w:p>
+            <w:pPr>
+              <w:spacing w:after="0"/>
+            </w:pPr>
+            <w:r>
+              <w:rPr>
+                <w:sz w:val="17"/>
+              </w:rPr>
+              <w:t>LOCAL_STATE_FAILED_INTERRUPTED</w:t>
+            </w:r>
+          </w:p>
+        </w:tc>
+        <w:tc>
+          <w:tcPr>
+            <w:tcW w:type="dxa" w:w="5360"/>
+            <w:tcMar>
+              <w:top w:w="80" w:type="dxa"/>
+              <w:start w:w="120" w:type="dxa"/>
+              <w:bottom w:w="80" w:type="dxa"/>
+              <w:end w:w="120" w:type="dxa"/>
+            </w:tcMar>
+            <w:vAlign w:val="center"/>
+          </w:tcPr>
+          <w:p>
+            <w:pPr>
+              <w:spacing w:after="0"/>
+            </w:pPr>
+            <w:r>
+              <w:rPr>
+                <w:sz w:val="17"/>
+              </w:rPr>
+              <w:t>被中断。</w:t>
+            </w:r>
+          </w:p>
+        </w:tc>
+      </w:tr>
+      <w:tr>
+        <w:tc>
+          <w:tcPr>
+            <w:tcW w:type="dxa" w:w="2200"/>
+            <w:tcMar>
+              <w:top w:w="80" w:type="dxa"/>
+              <w:start w:w="120" w:type="dxa"/>
+              <w:bottom w:w="80" w:type="dxa"/>
+              <w:end w:w="120" w:type="dxa"/>
+            </w:tcMar>
+            <w:vAlign w:val="center"/>
+          </w:tcPr>
+          <w:p>
+            <w:pPr>
+              <w:spacing w:after="0"/>
+            </w:pPr>
+            <w:r>
+              <w:rPr>
+                <w:sz w:val="17"/>
+              </w:rPr>
+              <w:t>13</w:t>
+            </w:r>
+          </w:p>
+        </w:tc>
+        <w:tc>
+          <w:tcPr>
+            <w:tcW w:type="dxa" w:w="1800"/>
+            <w:tcMar>
+              <w:top w:w="80" w:type="dxa"/>
+              <w:start w:w="120" w:type="dxa"/>
+              <w:bottom w:w="80" w:type="dxa"/>
+              <w:end w:w="120" w:type="dxa"/>
+            </w:tcMar>
+            <w:vAlign w:val="center"/>
+          </w:tcPr>
+          <w:p>
+            <w:pPr>
+              <w:spacing w:after="0"/>
+            </w:pPr>
+            <w:r>
+              <w:rPr>
+                <w:sz w:val="17"/>
+              </w:rPr>
+              <w:t>LOCAL_STATE_FAILED_VERSION_CONFLICT</w:t>
+            </w:r>
+          </w:p>
+        </w:tc>
+        <w:tc>
+          <w:tcPr>
+            <w:tcW w:type="dxa" w:w="5360"/>
+            <w:tcMar>
+              <w:top w:w="80" w:type="dxa"/>
+              <w:start w:w="120" w:type="dxa"/>
+              <w:bottom w:w="80" w:type="dxa"/>
+              <w:end w:w="120" w:type="dxa"/>
+            </w:tcMar>
+            <w:vAlign w:val="center"/>
+          </w:tcPr>
+          <w:p>
+            <w:pPr>
+              <w:spacing w:after="0"/>
+            </w:pPr>
+            <w:r>
+              <w:rPr>
+                <w:sz w:val="17"/>
+              </w:rPr>
+              <w:t>版本冲突。</w:t>
+            </w:r>
+          </w:p>
+        </w:tc>
+      </w:tr>
+      <w:tr>
+        <w:tc>
+          <w:tcPr>
+            <w:tcW w:type="dxa" w:w="2200"/>
+            <w:tcMar>
+              <w:top w:w="80" w:type="dxa"/>
+              <w:start w:w="120" w:type="dxa"/>
+              <w:bottom w:w="80" w:type="dxa"/>
+              <w:end w:w="120" w:type="dxa"/>
+            </w:tcMar>
+            <w:vAlign w:val="center"/>
+          </w:tcPr>
+          <w:p>
+            <w:pPr>
+              <w:spacing w:after="0"/>
+            </w:pPr>
+            <w:r>
+              <w:rPr>
+                <w:sz w:val="17"/>
+              </w:rPr>
+              <w:t>14</w:t>
+            </w:r>
+          </w:p>
+        </w:tc>
+        <w:tc>
+          <w:tcPr>
+            <w:tcW w:type="dxa" w:w="1800"/>
+            <w:tcMar>
+              <w:top w:w="80" w:type="dxa"/>
+              <w:start w:w="120" w:type="dxa"/>
+              <w:bottom w:w="80" w:type="dxa"/>
+              <w:end w:w="120" w:type="dxa"/>
+            </w:tcMar>
+            <w:vAlign w:val="center"/>
+          </w:tcPr>
+          <w:p>
+            <w:pPr>
+              <w:spacing w:after="0"/>
+            </w:pPr>
+            <w:r>
+              <w:rPr>
+                <w:sz w:val="17"/>
+              </w:rPr>
+              <w:t>LOCAL_STATE_FAILED_INVALID_REQUEST</w:t>
+            </w:r>
+          </w:p>
+        </w:tc>
+        <w:tc>
+          <w:tcPr>
+            <w:tcW w:type="dxa" w:w="5360"/>
+            <w:tcMar>
+              <w:top w:w="80" w:type="dxa"/>
+              <w:start w:w="120" w:type="dxa"/>
+              <w:bottom w:w="80" w:type="dxa"/>
+              <w:end w:w="120" w:type="dxa"/>
+            </w:tcMar>
+            <w:vAlign w:val="center"/>
+          </w:tcPr>
+          <w:p>
+            <w:pPr>
+              <w:spacing w:after="0"/>
+            </w:pPr>
+            <w:r>
+              <w:rPr>
+                <w:sz w:val="17"/>
+              </w:rPr>
+              <w:t>请求无效。</w:t>
+            </w:r>
+          </w:p>
+        </w:tc>
+      </w:tr>
+      <w:tr>
+        <w:tc>
+          <w:tcPr>
+            <w:tcW w:type="dxa" w:w="2200"/>
+            <w:tcMar>
+              <w:top w:w="80" w:type="dxa"/>
+              <w:start w:w="120" w:type="dxa"/>
+              <w:bottom w:w="80" w:type="dxa"/>
+              <w:end w:w="120" w:type="dxa"/>
+            </w:tcMar>
+            <w:vAlign w:val="center"/>
+          </w:tcPr>
+          <w:p>
+            <w:pPr>
+              <w:spacing w:after="0"/>
+            </w:pPr>
+            <w:r>
+              <w:rPr>
+                <w:sz w:val="17"/>
+              </w:rPr>
+              <w:t>15</w:t>
+            </w:r>
+          </w:p>
+        </w:tc>
+        <w:tc>
+          <w:tcPr>
+            <w:tcW w:type="dxa" w:w="1800"/>
+            <w:tcMar>
+              <w:top w:w="80" w:type="dxa"/>
+              <w:start w:w="120" w:type="dxa"/>
+              <w:bottom w:w="80" w:type="dxa"/>
+              <w:end w:w="120" w:type="dxa"/>
+            </w:tcMar>
+            <w:vAlign w:val="center"/>
+          </w:tcPr>
+          <w:p>
+            <w:pPr>
+              <w:spacing w:after="0"/>
+            </w:pPr>
+            <w:r>
+              <w:rPr>
+                <w:sz w:val="17"/>
+              </w:rPr>
+              <w:t>LOCAL_STATE_FAILED_BUSY</w:t>
+            </w:r>
+          </w:p>
+        </w:tc>
+        <w:tc>
+          <w:tcPr>
+            <w:tcW w:type="dxa" w:w="5360"/>
+            <w:tcMar>
+              <w:top w:w="80" w:type="dxa"/>
+              <w:start w:w="120" w:type="dxa"/>
+              <w:bottom w:w="80" w:type="dxa"/>
+              <w:end w:w="120" w:type="dxa"/>
+            </w:tcMar>
+            <w:vAlign w:val="center"/>
+          </w:tcPr>
+          <w:p>
+            <w:pPr>
+              <w:spacing w:after="0"/>
+            </w:pPr>
+            <w:r>
+              <w:rPr>
+                <w:sz w:val="17"/>
+              </w:rPr>
+              <w:t>目标忙。</w:t>
+            </w:r>
+          </w:p>
+        </w:tc>
+      </w:tr>
+      <w:tr>
+        <w:tc>
+          <w:tcPr>
+            <w:tcW w:type="dxa" w:w="2200"/>
+            <w:tcMar>
+              <w:top w:w="80" w:type="dxa"/>
+              <w:start w:w="120" w:type="dxa"/>
+              <w:bottom w:w="80" w:type="dxa"/>
+              <w:end w:w="120" w:type="dxa"/>
+            </w:tcMar>
+            <w:vAlign w:val="center"/>
+          </w:tcPr>
+          <w:p>
+            <w:pPr>
+              <w:spacing w:after="0"/>
+            </w:pPr>
+            <w:r>
+              <w:rPr>
+                <w:sz w:val="17"/>
+              </w:rPr>
+              <w:t>16</w:t>
+            </w:r>
+          </w:p>
+        </w:tc>
+        <w:tc>
+          <w:tcPr>
+            <w:tcW w:type="dxa" w:w="1800"/>
+            <w:tcMar>
+              <w:top w:w="80" w:type="dxa"/>
+              <w:start w:w="120" w:type="dxa"/>
+              <w:bottom w:w="80" w:type="dxa"/>
+              <w:end w:w="120" w:type="dxa"/>
+            </w:tcMar>
+            <w:vAlign w:val="center"/>
+          </w:tcPr>
+          <w:p>
+            <w:pPr>
+              <w:spacing w:after="0"/>
+            </w:pPr>
+            <w:r>
+              <w:rPr>
+                <w:sz w:val="17"/>
+              </w:rPr>
+              <w:t>LOCAL_STATE_FAILED_BUSY_WITH_OVERRIDE_OPTION</w:t>
+            </w:r>
+          </w:p>
+        </w:tc>
+        <w:tc>
+          <w:tcPr>
+            <w:tcW w:type="dxa" w:w="5360"/>
+            <w:tcMar>
+              <w:top w:w="80" w:type="dxa"/>
+              <w:start w:w="120" w:type="dxa"/>
+              <w:bottom w:w="80" w:type="dxa"/>
+              <w:end w:w="120" w:type="dxa"/>
+            </w:tcMar>
+            <w:vAlign w:val="center"/>
+          </w:tcPr>
+          <w:p>
+            <w:pPr>
+              <w:spacing w:after="0"/>
+            </w:pPr>
+            <w:r>
+              <w:rPr>
+                <w:sz w:val="17"/>
+              </w:rPr>
+              <w:t>目标忙，但可选择覆盖。</w:t>
+            </w:r>
+          </w:p>
+        </w:tc>
+      </w:tr>
+      <w:tr>
+        <w:tc>
+          <w:tcPr>
+            <w:tcW w:type="dxa" w:w="2200"/>
+            <w:tcMar>
+              <w:top w:w="80" w:type="dxa"/>
+              <w:start w:w="120" w:type="dxa"/>
+              <w:bottom w:w="80" w:type="dxa"/>
+              <w:end w:w="120" w:type="dxa"/>
+            </w:tcMar>
+            <w:vAlign w:val="center"/>
+          </w:tcPr>
+          <w:p>
+            <w:pPr>
+              <w:spacing w:after="0"/>
+            </w:pPr>
+            <w:r>
+              <w:rPr>
+                <w:sz w:val="17"/>
+              </w:rPr>
+              <w:t>17</w:t>
+            </w:r>
+          </w:p>
+        </w:tc>
+        <w:tc>
+          <w:tcPr>
+            <w:tcW w:type="dxa" w:w="1800"/>
+            <w:tcMar>
+              <w:top w:w="80" w:type="dxa"/>
+              <w:start w:w="120" w:type="dxa"/>
+              <w:bottom w:w="80" w:type="dxa"/>
+              <w:end w:w="120" w:type="dxa"/>
+            </w:tcMar>
+            <w:vAlign w:val="center"/>
+          </w:tcPr>
+          <w:p>
+            <w:pPr>
+              <w:spacing w:after="0"/>
+            </w:pPr>
+            <w:r>
+              <w:rPr>
+                <w:sz w:val="17"/>
+              </w:rPr>
+              <w:t>LOCAL_STATE_FAILED_CONTINUE_LIVE_ANNOUNCEMENT_TIMEOUT</w:t>
+            </w:r>
+          </w:p>
+        </w:tc>
+        <w:tc>
+          <w:tcPr>
+            <w:tcW w:type="dxa" w:w="5360"/>
+            <w:tcMar>
+              <w:top w:w="80" w:type="dxa"/>
+              <w:start w:w="120" w:type="dxa"/>
+              <w:bottom w:w="80" w:type="dxa"/>
+              <w:end w:w="120" w:type="dxa"/>
+            </w:tcMar>
+            <w:vAlign w:val="center"/>
+          </w:tcPr>
+          <w:p>
+            <w:pPr>
+              <w:spacing w:after="0"/>
+            </w:pPr>
+            <w:r>
+              <w:rPr>
+                <w:sz w:val="17"/>
+              </w:rPr>
+              <w:t>未收到 TIMS 的继续广播请求，超时。</w:t>
+            </w:r>
+          </w:p>
+        </w:tc>
+      </w:tr>
+      <w:tr>
+        <w:tc>
+          <w:tcPr>
+            <w:tcW w:type="dxa" w:w="2200"/>
+            <w:tcMar>
+              <w:top w:w="80" w:type="dxa"/>
+              <w:start w:w="120" w:type="dxa"/>
+              <w:bottom w:w="80" w:type="dxa"/>
+              <w:end w:w="120" w:type="dxa"/>
+            </w:tcMar>
+            <w:vAlign w:val="center"/>
+          </w:tcPr>
+          <w:p>
+            <w:pPr>
+              <w:spacing w:after="0"/>
+            </w:pPr>
+            <w:r>
+              <w:rPr>
+                <w:sz w:val="17"/>
+              </w:rPr>
+              <w:t>18</w:t>
+            </w:r>
+          </w:p>
+        </w:tc>
+        <w:tc>
+          <w:tcPr>
+            <w:tcW w:type="dxa" w:w="1800"/>
+            <w:tcMar>
+              <w:top w:w="80" w:type="dxa"/>
+              <w:start w:w="120" w:type="dxa"/>
+              <w:bottom w:w="80" w:type="dxa"/>
+              <w:end w:w="120" w:type="dxa"/>
+            </w:tcMar>
+            <w:vAlign w:val="center"/>
+          </w:tcPr>
+          <w:p>
+            <w:pPr>
+              <w:spacing w:after="0"/>
+            </w:pPr>
+            <w:r>
+              <w:rPr>
+                <w:sz w:val="17"/>
+              </w:rPr>
+              <w:t>LOCAL_STATE_FAILED_NO_PERMISSION</w:t>
+            </w:r>
+          </w:p>
+        </w:tc>
+        <w:tc>
+          <w:tcPr>
+            <w:tcW w:type="dxa" w:w="5360"/>
+            <w:tcMar>
+              <w:top w:w="80" w:type="dxa"/>
+              <w:start w:w="120" w:type="dxa"/>
+              <w:bottom w:w="80" w:type="dxa"/>
+              <w:end w:w="120" w:type="dxa"/>
+            </w:tcMar>
+            <w:vAlign w:val="center"/>
+          </w:tcPr>
+          <w:p>
+            <w:pPr>
+              <w:spacing w:after="0"/>
+            </w:pPr>
+            <w:r>
+              <w:rPr>
+                <w:sz w:val="17"/>
+              </w:rPr>
+              <w:t>当前地点对此列车无 duty/权限。</w:t>
+            </w:r>
+          </w:p>
+        </w:tc>
+      </w:tr>
+      <w:tr>
+        <w:tc>
+          <w:tcPr>
+            <w:tcW w:type="dxa" w:w="2200"/>
+            <w:tcMar>
+              <w:top w:w="80" w:type="dxa"/>
+              <w:start w:w="120" w:type="dxa"/>
+              <w:bottom w:w="80" w:type="dxa"/>
+              <w:end w:w="120" w:type="dxa"/>
+            </w:tcMar>
+            <w:vAlign w:val="center"/>
+          </w:tcPr>
+          <w:p>
+            <w:pPr>
+              <w:spacing w:after="0"/>
+            </w:pPr>
+            <w:r>
+              <w:rPr>
+                <w:sz w:val="17"/>
+              </w:rPr>
+              <w:t>19</w:t>
+            </w:r>
+          </w:p>
+        </w:tc>
+        <w:tc>
+          <w:tcPr>
+            <w:tcW w:type="dxa" w:w="1800"/>
+            <w:tcMar>
+              <w:top w:w="80" w:type="dxa"/>
+              <w:start w:w="120" w:type="dxa"/>
+              <w:bottom w:w="80" w:type="dxa"/>
+              <w:end w:w="120" w:type="dxa"/>
+            </w:tcMar>
+            <w:vAlign w:val="center"/>
+          </w:tcPr>
+          <w:p>
+            <w:pPr>
+              <w:spacing w:after="0"/>
+            </w:pPr>
+            <w:r>
+              <w:rPr>
+                <w:sz w:val="17"/>
+              </w:rPr>
+              <w:t>LOCAL_STATE_TRAIN_FIRST_CYCLE_CANCELLED</w:t>
+            </w:r>
+          </w:p>
+        </w:tc>
+        <w:tc>
+          <w:tcPr>
+            <w:tcW w:type="dxa" w:w="5360"/>
+            <w:tcMar>
+              <w:top w:w="80" w:type="dxa"/>
+              <w:start w:w="120" w:type="dxa"/>
+              <w:bottom w:w="80" w:type="dxa"/>
+              <w:end w:w="120" w:type="dxa"/>
+            </w:tcMar>
+            <w:vAlign w:val="center"/>
+          </w:tcPr>
+          <w:p>
+            <w:pPr>
+              <w:spacing w:after="0"/>
+            </w:pPr>
+            <w:r>
+              <w:rPr>
+                <w:sz w:val="17"/>
+              </w:rPr>
+              <w:t>列车首个循环已取消。</w:t>
+            </w:r>
+          </w:p>
+        </w:tc>
+      </w:tr>
+      <w:tr>
+        <w:tc>
+          <w:tcPr>
+            <w:tcW w:type="dxa" w:w="2200"/>
+            <w:tcMar>
+              <w:top w:w="80" w:type="dxa"/>
+              <w:start w:w="120" w:type="dxa"/>
+              <w:bottom w:w="80" w:type="dxa"/>
+              <w:end w:w="120" w:type="dxa"/>
+            </w:tcMar>
+            <w:vAlign w:val="center"/>
+          </w:tcPr>
+          <w:p>
+            <w:pPr>
+              <w:spacing w:after="0"/>
+            </w:pPr>
+            <w:r>
+              <w:rPr>
+                <w:sz w:val="17"/>
+              </w:rPr>
+              <w:t>20</w:t>
+            </w:r>
+          </w:p>
+        </w:tc>
+        <w:tc>
+          <w:tcPr>
+            <w:tcW w:type="dxa" w:w="1800"/>
+            <w:tcMar>
+              <w:top w:w="80" w:type="dxa"/>
+              <w:start w:w="120" w:type="dxa"/>
+              <w:bottom w:w="80" w:type="dxa"/>
+              <w:end w:w="120" w:type="dxa"/>
+            </w:tcMar>
+            <w:vAlign w:val="center"/>
+          </w:tcPr>
+          <w:p>
+            <w:pPr>
+              <w:spacing w:after="0"/>
+            </w:pPr>
+            <w:r>
+              <w:rPr>
+                <w:sz w:val="17"/>
+              </w:rPr>
+              <w:t>LOCAL_STATE_FAILED_BAD_COMMAND</w:t>
+            </w:r>
+          </w:p>
+        </w:tc>
+        <w:tc>
+          <w:tcPr>
+            <w:tcW w:type="dxa" w:w="5360"/>
+            <w:tcMar>
+              <w:top w:w="80" w:type="dxa"/>
+              <w:start w:w="120" w:type="dxa"/>
+              <w:bottom w:w="80" w:type="dxa"/>
+              <w:end w:w="120" w:type="dxa"/>
+            </w:tcMar>
+            <w:vAlign w:val="center"/>
+          </w:tcPr>
+          <w:p>
+            <w:pPr>
+              <w:spacing w:after="0"/>
+            </w:pPr>
+            <w:r>
+              <w:rPr>
+                <w:sz w:val="17"/>
+              </w:rPr>
+              <w:t>列车返回无效/错误命令。</w:t>
+            </w:r>
+          </w:p>
+        </w:tc>
+      </w:tr>
+      <w:tr>
+        <w:tc>
+          <w:tcPr>
+            <w:tcW w:type="dxa" w:w="2200"/>
+            <w:tcMar>
+              <w:top w:w="80" w:type="dxa"/>
+              <w:start w:w="120" w:type="dxa"/>
+              <w:bottom w:w="80" w:type="dxa"/>
+              <w:end w:w="120" w:type="dxa"/>
+            </w:tcMar>
+            <w:vAlign w:val="center"/>
+          </w:tcPr>
+          <w:p>
+            <w:pPr>
+              <w:spacing w:after="0"/>
+            </w:pPr>
+            <w:r>
+              <w:rPr>
+                <w:sz w:val="17"/>
+              </w:rPr>
+              <w:t>21</w:t>
+            </w:r>
+          </w:p>
+        </w:tc>
+        <w:tc>
+          <w:tcPr>
+            <w:tcW w:type="dxa" w:w="1800"/>
+            <w:tcMar>
+              <w:top w:w="80" w:type="dxa"/>
+              <w:start w:w="120" w:type="dxa"/>
+              <w:bottom w:w="80" w:type="dxa"/>
+              <w:end w:w="120" w:type="dxa"/>
+            </w:tcMar>
+            <w:vAlign w:val="center"/>
+          </w:tcPr>
+          <w:p>
+            <w:pPr>
+              <w:spacing w:after="0"/>
+            </w:pPr>
+            <w:r>
+              <w:rPr>
+                <w:sz w:val="17"/>
+              </w:rPr>
+              <w:t>LOCAL_STATE_FAILED_DIFFERENT_ORIGIN</w:t>
+            </w:r>
+          </w:p>
+        </w:tc>
+        <w:tc>
+          <w:tcPr>
+            <w:tcW w:type="dxa" w:w="5360"/>
+            <w:tcMar>
+              <w:top w:w="80" w:type="dxa"/>
+              <w:start w:w="120" w:type="dxa"/>
+              <w:bottom w:w="80" w:type="dxa"/>
+              <w:end w:w="120" w:type="dxa"/>
+            </w:tcMar>
+            <w:vAlign w:val="center"/>
+          </w:tcPr>
+          <w:p>
+            <w:pPr>
+              <w:spacing w:after="0"/>
+            </w:pPr>
+            <w:r>
+              <w:rPr>
+                <w:sz w:val="17"/>
+              </w:rPr>
+              <w:t>来源不匹配。</w:t>
+            </w:r>
+          </w:p>
+        </w:tc>
+      </w:tr>
+      <w:tr>
+        <w:tc>
+          <w:tcPr>
+            <w:tcW w:type="dxa" w:w="2200"/>
+            <w:tcMar>
+              <w:top w:w="80" w:type="dxa"/>
+              <w:start w:w="120" w:type="dxa"/>
+              <w:bottom w:w="80" w:type="dxa"/>
+              <w:end w:w="120" w:type="dxa"/>
+            </w:tcMar>
+            <w:vAlign w:val="center"/>
+          </w:tcPr>
+          <w:p>
+            <w:pPr>
+              <w:spacing w:after="0"/>
+            </w:pPr>
+            <w:r>
+              <w:rPr>
+                <w:sz w:val="17"/>
+              </w:rPr>
+              <w:t>22</w:t>
+            </w:r>
+          </w:p>
+        </w:tc>
+        <w:tc>
+          <w:tcPr>
+            <w:tcW w:type="dxa" w:w="1800"/>
+            <w:tcMar>
+              <w:top w:w="80" w:type="dxa"/>
+              <w:start w:w="120" w:type="dxa"/>
+              <w:bottom w:w="80" w:type="dxa"/>
+              <w:end w:w="120" w:type="dxa"/>
+            </w:tcMar>
+            <w:vAlign w:val="center"/>
+          </w:tcPr>
+          <w:p>
+            <w:pPr>
+              <w:spacing w:after="0"/>
+            </w:pPr>
+            <w:r>
+              <w:rPr>
+                <w:sz w:val="17"/>
+              </w:rPr>
+              <w:t>LOCAL_STATE_FAILED_DIFFERENT_VERSION</w:t>
+            </w:r>
+          </w:p>
+        </w:tc>
+        <w:tc>
+          <w:tcPr>
+            <w:tcW w:type="dxa" w:w="5360"/>
+            <w:tcMar>
+              <w:top w:w="80" w:type="dxa"/>
+              <w:start w:w="120" w:type="dxa"/>
+              <w:bottom w:w="80" w:type="dxa"/>
+              <w:end w:w="120" w:type="dxa"/>
+            </w:tcMar>
+            <w:vAlign w:val="center"/>
+          </w:tcPr>
+          <w:p>
+            <w:pPr>
+              <w:spacing w:after="0"/>
+            </w:pPr>
+            <w:r>
+              <w:rPr>
+                <w:sz w:val="17"/>
+              </w:rPr>
+              <w:t>版本不匹配。</w:t>
+            </w:r>
+          </w:p>
+        </w:tc>
+      </w:tr>
+      <w:tr>
+        <w:tc>
+          <w:tcPr>
+            <w:tcW w:type="dxa" w:w="2200"/>
+            <w:tcMar>
+              <w:top w:w="80" w:type="dxa"/>
+              <w:start w:w="120" w:type="dxa"/>
+              <w:bottom w:w="80" w:type="dxa"/>
+              <w:end w:w="120" w:type="dxa"/>
+            </w:tcMar>
+            <w:vAlign w:val="center"/>
+          </w:tcPr>
+          <w:p>
+            <w:pPr>
+              <w:spacing w:after="0"/>
+            </w:pPr>
+            <w:r>
+              <w:rPr>
+                <w:sz w:val="17"/>
+              </w:rPr>
+              <w:t>23</w:t>
+            </w:r>
+          </w:p>
+        </w:tc>
+        <w:tc>
+          <w:tcPr>
+            <w:tcW w:type="dxa" w:w="1800"/>
+            <w:tcMar>
+              <w:top w:w="80" w:type="dxa"/>
+              <w:start w:w="120" w:type="dxa"/>
+              <w:bottom w:w="80" w:type="dxa"/>
+              <w:end w:w="120" w:type="dxa"/>
+            </w:tcMar>
+            <w:vAlign w:val="center"/>
+          </w:tcPr>
+          <w:p>
+            <w:pPr>
+              <w:spacing w:after="0"/>
+            </w:pPr>
+            <w:r>
+              <w:rPr>
+                <w:sz w:val="17"/>
+              </w:rPr>
+              <w:t>LOCAL_STATE_FAILED_MPU_CHANGEOVER</w:t>
+            </w:r>
+          </w:p>
+        </w:tc>
+        <w:tc>
+          <w:tcPr>
+            <w:tcW w:type="dxa" w:w="5360"/>
+            <w:tcMar>
+              <w:top w:w="80" w:type="dxa"/>
+              <w:start w:w="120" w:type="dxa"/>
+              <w:bottom w:w="80" w:type="dxa"/>
+              <w:end w:w="120" w:type="dxa"/>
+            </w:tcMar>
+            <w:vAlign w:val="center"/>
+          </w:tcPr>
+          <w:p>
+            <w:pPr>
+              <w:spacing w:after="0"/>
+            </w:pPr>
+            <w:r>
+              <w:rPr>
+                <w:sz w:val="17"/>
+              </w:rPr>
+              <w:t>MPU 切换失败。</w:t>
+            </w:r>
+          </w:p>
+        </w:tc>
+      </w:tr>
+    </w:tbl>
+    <w:p>
+      <w:pPr>
+        <w:spacing w:after="0"/>
+      </w:pPr>
+    </w:p>
+    <w:p>
+      <w:pPr>
         <w:pStyle w:val="Heading3"/>
       </w:pPr>
       <w:r>

</xml_diff>

<commit_message>
docs: describe Kafka broadcast types
</commit_message>
<xml_diff>
--- a/docs/PABridgeAgent_Kafka_Integration.docx
+++ b/docs/PABridgeAgent_Kafka_Integration.docx
@@ -4169,6 +4169,421 @@
         <w:spacing w:after="100"/>
       </w:pPr>
       <w:r>
+        <w:t>#### broadcastType 枚举值</w:t>
+      </w:r>
+    </w:p>
+    <w:tbl>
+      <w:tblPr>
+        <w:tblStyle w:val="TableGrid"/>
+        <w:tblW w:type="dxa" w:w="9360"/>
+        <w:jc w:val="left"/>
+        <w:tblLayout w:type="fixed"/>
+        <w:tblLook w:firstColumn="1" w:firstRow="1" w:lastColumn="0" w:lastRow="0" w:noHBand="0" w:noVBand="1" w:val="04A0"/>
+        <w:tblInd w:w="120" w:type="dxa"/>
+      </w:tblPr>
+      <w:tblGrid>
+        <w:gridCol w:w="3000"/>
+        <w:gridCol w:w="6360"/>
+      </w:tblGrid>
+      <w:tr>
+        <w:tc>
+          <w:tcPr>
+            <w:tcW w:type="dxa" w:w="3000"/>
+            <w:tcMar>
+              <w:top w:w="80" w:type="dxa"/>
+              <w:start w:w="120" w:type="dxa"/>
+              <w:bottom w:w="80" w:type="dxa"/>
+              <w:end w:w="120" w:type="dxa"/>
+            </w:tcMar>
+            <w:vAlign w:val="center"/>
+            <w:shd w:fill="E8EEF5"/>
+          </w:tcPr>
+          <w:p>
+            <w:pPr>
+              <w:spacing w:after="0"/>
+            </w:pPr>
+            <w:r>
+              <w:rPr>
+                <w:b/>
+                <w:sz w:val="17"/>
+              </w:rPr>
+              <w:t>值</w:t>
+            </w:r>
+          </w:p>
+        </w:tc>
+        <w:tc>
+          <w:tcPr>
+            <w:tcW w:type="dxa" w:w="6360"/>
+            <w:tcMar>
+              <w:top w:w="80" w:type="dxa"/>
+              <w:start w:w="120" w:type="dxa"/>
+              <w:bottom w:w="80" w:type="dxa"/>
+              <w:end w:w="120" w:type="dxa"/>
+            </w:tcMar>
+            <w:vAlign w:val="center"/>
+            <w:shd w:fill="E8EEF5"/>
+          </w:tcPr>
+          <w:p>
+            <w:pPr>
+              <w:spacing w:after="0"/>
+            </w:pPr>
+            <w:r>
+              <w:rPr>
+                <w:b/>
+                <w:sz w:val="17"/>
+              </w:rPr>
+              <w:t>含义</w:t>
+            </w:r>
+          </w:p>
+        </w:tc>
+      </w:tr>
+      <w:tr>
+        <w:tc>
+          <w:tcPr>
+            <w:tcW w:type="dxa" w:w="3000"/>
+            <w:tcMar>
+              <w:top w:w="80" w:type="dxa"/>
+              <w:start w:w="120" w:type="dxa"/>
+              <w:bottom w:w="80" w:type="dxa"/>
+              <w:end w:w="120" w:type="dxa"/>
+            </w:tcMar>
+            <w:vAlign w:val="center"/>
+          </w:tcPr>
+          <w:p>
+            <w:pPr>
+              <w:spacing w:after="0"/>
+            </w:pPr>
+            <w:r>
+              <w:rPr>
+                <w:sz w:val="17"/>
+              </w:rPr>
+              <w:t>StationMusic</w:t>
+            </w:r>
+          </w:p>
+        </w:tc>
+        <w:tc>
+          <w:tcPr>
+            <w:tcW w:type="dxa" w:w="6360"/>
+            <w:tcMar>
+              <w:top w:w="80" w:type="dxa"/>
+              <w:start w:w="120" w:type="dxa"/>
+              <w:bottom w:w="80" w:type="dxa"/>
+              <w:end w:w="120" w:type="dxa"/>
+            </w:tcMar>
+            <w:vAlign w:val="center"/>
+          </w:tcPr>
+          <w:p>
+            <w:pPr>
+              <w:spacing w:after="0"/>
+            </w:pPr>
+            <w:r>
+              <w:rPr>
+                <w:sz w:val="17"/>
+              </w:rPr>
+              <w:t>车站音乐广播。</w:t>
+            </w:r>
+          </w:p>
+        </w:tc>
+      </w:tr>
+      <w:tr>
+        <w:tc>
+          <w:tcPr>
+            <w:tcW w:type="dxa" w:w="3000"/>
+            <w:tcMar>
+              <w:top w:w="80" w:type="dxa"/>
+              <w:start w:w="120" w:type="dxa"/>
+              <w:bottom w:w="80" w:type="dxa"/>
+              <w:end w:w="120" w:type="dxa"/>
+            </w:tcMar>
+            <w:vAlign w:val="center"/>
+          </w:tcPr>
+          <w:p>
+            <w:pPr>
+              <w:spacing w:after="0"/>
+            </w:pPr>
+            <w:r>
+              <w:rPr>
+                <w:sz w:val="17"/>
+              </w:rPr>
+              <w:t>StationLive</w:t>
+            </w:r>
+          </w:p>
+        </w:tc>
+        <w:tc>
+          <w:tcPr>
+            <w:tcW w:type="dxa" w:w="6360"/>
+            <w:tcMar>
+              <w:top w:w="80" w:type="dxa"/>
+              <w:start w:w="120" w:type="dxa"/>
+              <w:bottom w:w="80" w:type="dxa"/>
+              <w:end w:w="120" w:type="dxa"/>
+            </w:tcMar>
+            <w:vAlign w:val="center"/>
+          </w:tcPr>
+          <w:p>
+            <w:pPr>
+              <w:spacing w:after="0"/>
+            </w:pPr>
+            <w:r>
+              <w:rPr>
+                <w:sz w:val="17"/>
+              </w:rPr>
+              <w:t>车站实时广播。</w:t>
+            </w:r>
+          </w:p>
+        </w:tc>
+      </w:tr>
+      <w:tr>
+        <w:tc>
+          <w:tcPr>
+            <w:tcW w:type="dxa" w:w="3000"/>
+            <w:tcMar>
+              <w:top w:w="80" w:type="dxa"/>
+              <w:start w:w="120" w:type="dxa"/>
+              <w:bottom w:w="80" w:type="dxa"/>
+              <w:end w:w="120" w:type="dxa"/>
+            </w:tcMar>
+            <w:vAlign w:val="center"/>
+          </w:tcPr>
+          <w:p>
+            <w:pPr>
+              <w:spacing w:after="0"/>
+            </w:pPr>
+            <w:r>
+              <w:rPr>
+                <w:sz w:val="17"/>
+              </w:rPr>
+              <w:t>StationDva</w:t>
+            </w:r>
+          </w:p>
+        </w:tc>
+        <w:tc>
+          <w:tcPr>
+            <w:tcW w:type="dxa" w:w="6360"/>
+            <w:tcMar>
+              <w:top w:w="80" w:type="dxa"/>
+              <w:start w:w="120" w:type="dxa"/>
+              <w:bottom w:w="80" w:type="dxa"/>
+              <w:end w:w="120" w:type="dxa"/>
+            </w:tcMar>
+            <w:vAlign w:val="center"/>
+          </w:tcPr>
+          <w:p>
+            <w:pPr>
+              <w:spacing w:after="0"/>
+            </w:pPr>
+            <w:r>
+              <w:rPr>
+                <w:sz w:val="17"/>
+              </w:rPr>
+              <w:t>车站 DVA（数字语音公告）广播。</w:t>
+            </w:r>
+          </w:p>
+        </w:tc>
+      </w:tr>
+      <w:tr>
+        <w:tc>
+          <w:tcPr>
+            <w:tcW w:type="dxa" w:w="3000"/>
+            <w:tcMar>
+              <w:top w:w="80" w:type="dxa"/>
+              <w:start w:w="120" w:type="dxa"/>
+              <w:bottom w:w="80" w:type="dxa"/>
+              <w:end w:w="120" w:type="dxa"/>
+            </w:tcMar>
+            <w:vAlign w:val="center"/>
+          </w:tcPr>
+          <w:p>
+            <w:pPr>
+              <w:spacing w:after="0"/>
+            </w:pPr>
+            <w:r>
+              <w:rPr>
+                <w:sz w:val="17"/>
+              </w:rPr>
+              <w:t>StationRecording</w:t>
+            </w:r>
+          </w:p>
+        </w:tc>
+        <w:tc>
+          <w:tcPr>
+            <w:tcW w:type="dxa" w:w="6360"/>
+            <w:tcMar>
+              <w:top w:w="80" w:type="dxa"/>
+              <w:start w:w="120" w:type="dxa"/>
+              <w:bottom w:w="80" w:type="dxa"/>
+              <w:end w:w="120" w:type="dxa"/>
+            </w:tcMar>
+            <w:vAlign w:val="center"/>
+          </w:tcPr>
+          <w:p>
+            <w:pPr>
+              <w:spacing w:after="0"/>
+            </w:pPr>
+            <w:r>
+              <w:rPr>
+                <w:sz w:val="17"/>
+              </w:rPr>
+              <w:t>车站临时/adhoc 语音录制。</w:t>
+            </w:r>
+          </w:p>
+        </w:tc>
+      </w:tr>
+      <w:tr>
+        <w:tc>
+          <w:tcPr>
+            <w:tcW w:type="dxa" w:w="3000"/>
+            <w:tcMar>
+              <w:top w:w="80" w:type="dxa"/>
+              <w:start w:w="120" w:type="dxa"/>
+              <w:bottom w:w="80" w:type="dxa"/>
+              <w:end w:w="120" w:type="dxa"/>
+            </w:tcMar>
+            <w:vAlign w:val="center"/>
+          </w:tcPr>
+          <w:p>
+            <w:pPr>
+              <w:spacing w:after="0"/>
+            </w:pPr>
+            <w:r>
+              <w:rPr>
+                <w:sz w:val="17"/>
+              </w:rPr>
+              <w:t>TrainLive</w:t>
+            </w:r>
+          </w:p>
+        </w:tc>
+        <w:tc>
+          <w:tcPr>
+            <w:tcW w:type="dxa" w:w="6360"/>
+            <w:tcMar>
+              <w:top w:w="80" w:type="dxa"/>
+              <w:start w:w="120" w:type="dxa"/>
+              <w:bottom w:w="80" w:type="dxa"/>
+              <w:end w:w="120" w:type="dxa"/>
+            </w:tcMar>
+            <w:vAlign w:val="center"/>
+          </w:tcPr>
+          <w:p>
+            <w:pPr>
+              <w:spacing w:after="0"/>
+            </w:pPr>
+            <w:r>
+              <w:rPr>
+                <w:sz w:val="17"/>
+              </w:rPr>
+              <w:t>列车实时广播。</w:t>
+            </w:r>
+          </w:p>
+        </w:tc>
+      </w:tr>
+      <w:tr>
+        <w:tc>
+          <w:tcPr>
+            <w:tcW w:type="dxa" w:w="3000"/>
+            <w:tcMar>
+              <w:top w:w="80" w:type="dxa"/>
+              <w:start w:w="120" w:type="dxa"/>
+              <w:bottom w:w="80" w:type="dxa"/>
+              <w:end w:w="120" w:type="dxa"/>
+            </w:tcMar>
+            <w:vAlign w:val="center"/>
+          </w:tcPr>
+          <w:p>
+            <w:pPr>
+              <w:spacing w:after="0"/>
+            </w:pPr>
+            <w:r>
+              <w:rPr>
+                <w:sz w:val="17"/>
+              </w:rPr>
+              <w:t>TrainDva</w:t>
+            </w:r>
+          </w:p>
+        </w:tc>
+        <w:tc>
+          <w:tcPr>
+            <w:tcW w:type="dxa" w:w="6360"/>
+            <w:tcMar>
+              <w:top w:w="80" w:type="dxa"/>
+              <w:start w:w="120" w:type="dxa"/>
+              <w:bottom w:w="80" w:type="dxa"/>
+              <w:end w:w="120" w:type="dxa"/>
+            </w:tcMar>
+            <w:vAlign w:val="center"/>
+          </w:tcPr>
+          <w:p>
+            <w:pPr>
+              <w:spacing w:after="0"/>
+            </w:pPr>
+            <w:r>
+              <w:rPr>
+                <w:sz w:val="17"/>
+              </w:rPr>
+              <w:t>列车 DVA（数字语音公告）广播。</w:t>
+            </w:r>
+          </w:p>
+        </w:tc>
+      </w:tr>
+      <w:tr>
+        <w:tc>
+          <w:tcPr>
+            <w:tcW w:type="dxa" w:w="3000"/>
+            <w:tcMar>
+              <w:top w:w="80" w:type="dxa"/>
+              <w:start w:w="120" w:type="dxa"/>
+              <w:bottom w:w="80" w:type="dxa"/>
+              <w:end w:w="120" w:type="dxa"/>
+            </w:tcMar>
+            <w:vAlign w:val="center"/>
+          </w:tcPr>
+          <w:p>
+            <w:pPr>
+              <w:spacing w:after="0"/>
+            </w:pPr>
+            <w:r>
+              <w:rPr>
+                <w:sz w:val="17"/>
+              </w:rPr>
+              <w:t>Unknown</w:t>
+            </w:r>
+          </w:p>
+        </w:tc>
+        <w:tc>
+          <w:tcPr>
+            <w:tcW w:type="dxa" w:w="6360"/>
+            <w:tcMar>
+              <w:top w:w="80" w:type="dxa"/>
+              <w:start w:w="120" w:type="dxa"/>
+              <w:bottom w:w="80" w:type="dxa"/>
+              <w:end w:w="120" w:type="dxa"/>
+            </w:tcMar>
+            <w:vAlign w:val="center"/>
+          </w:tcPr>
+          <w:p>
+            <w:pPr>
+              <w:spacing w:after="0"/>
+            </w:pPr>
+            <w:r>
+              <w:rPr>
+                <w:sz w:val="17"/>
+              </w:rPr>
+              <w:t>未识别的 PAAgent 广播类型；不是正常定义的广播类型。</w:t>
+            </w:r>
+          </w:p>
+        </w:tc>
+      </w:tr>
+    </w:tbl>
+    <w:p>
+      <w:pPr>
+        <w:spacing w:after="0"/>
+      </w:pPr>
+    </w:p>
+    <w:p>
+      <w:pPr>
+        <w:spacing w:after="100"/>
+      </w:pPr>
+      <w:r>
         <w:t xml:space="preserve">注意：当前实现会转发 </w:t>
       </w:r>
       <w:r>

</xml_diff>

<commit_message>
docs: describe Kafka DVA message types
</commit_message>
<xml_diff>
--- a/docs/PABridgeAgent_Kafka_Integration.docx
+++ b/docs/PABridgeAgent_Kafka_Integration.docx
@@ -4677,6 +4677,244 @@
     </w:p>
     <w:p>
       <w:pPr>
+        <w:spacing w:after="100"/>
+      </w:pPr>
+      <w:r>
+        <w:t>#### type 枚举值</w:t>
+      </w:r>
+    </w:p>
+    <w:p>
+      <w:pPr>
+        <w:spacing w:after="100"/>
+      </w:pPr>
+      <w:r>
+        <w:rPr>
+          <w:rFonts w:ascii="Consolas" w:hAnsi="Consolas"/>
+          <w:sz w:val="17"/>
+        </w:rPr>
+        <w:t>type</w:t>
+      </w:r>
+      <w:r>
+        <w:t xml:space="preserve"> 是单字符字符串，用于表示站台 DVA 消息类型。</w:t>
+      </w:r>
+    </w:p>
+    <w:tbl>
+      <w:tblPr>
+        <w:tblStyle w:val="TableGrid"/>
+        <w:tblW w:type="dxa" w:w="9360"/>
+        <w:jc w:val="left"/>
+        <w:tblLayout w:type="fixed"/>
+        <w:tblLook w:firstColumn="1" w:firstRow="1" w:lastColumn="0" w:lastRow="0" w:noHBand="0" w:noVBand="1" w:val="04A0"/>
+        <w:tblInd w:w="120" w:type="dxa"/>
+      </w:tblPr>
+      <w:tblGrid>
+        <w:gridCol w:w="3000"/>
+        <w:gridCol w:w="6360"/>
+      </w:tblGrid>
+      <w:tr>
+        <w:tc>
+          <w:tcPr>
+            <w:tcW w:type="dxa" w:w="3000"/>
+            <w:tcMar>
+              <w:top w:w="80" w:type="dxa"/>
+              <w:start w:w="120" w:type="dxa"/>
+              <w:bottom w:w="80" w:type="dxa"/>
+              <w:end w:w="120" w:type="dxa"/>
+            </w:tcMar>
+            <w:vAlign w:val="center"/>
+            <w:shd w:fill="E8EEF5"/>
+          </w:tcPr>
+          <w:p>
+            <w:pPr>
+              <w:spacing w:after="0"/>
+            </w:pPr>
+            <w:r>
+              <w:rPr>
+                <w:b/>
+                <w:sz w:val="17"/>
+              </w:rPr>
+              <w:t>值</w:t>
+            </w:r>
+          </w:p>
+        </w:tc>
+        <w:tc>
+          <w:tcPr>
+            <w:tcW w:type="dxa" w:w="6360"/>
+            <w:tcMar>
+              <w:top w:w="80" w:type="dxa"/>
+              <w:start w:w="120" w:type="dxa"/>
+              <w:bottom w:w="80" w:type="dxa"/>
+              <w:end w:w="120" w:type="dxa"/>
+            </w:tcMar>
+            <w:vAlign w:val="center"/>
+            <w:shd w:fill="E8EEF5"/>
+          </w:tcPr>
+          <w:p>
+            <w:pPr>
+              <w:spacing w:after="0"/>
+            </w:pPr>
+            <w:r>
+              <w:rPr>
+                <w:b/>
+                <w:sz w:val="17"/>
+              </w:rPr>
+              <w:t>含义</w:t>
+            </w:r>
+          </w:p>
+        </w:tc>
+      </w:tr>
+      <w:tr>
+        <w:tc>
+          <w:tcPr>
+            <w:tcW w:type="dxa" w:w="3000"/>
+            <w:tcMar>
+              <w:top w:w="80" w:type="dxa"/>
+              <w:start w:w="120" w:type="dxa"/>
+              <w:bottom w:w="80" w:type="dxa"/>
+              <w:end w:w="120" w:type="dxa"/>
+            </w:tcMar>
+            <w:vAlign w:val="center"/>
+          </w:tcPr>
+          <w:p>
+            <w:pPr>
+              <w:spacing w:after="0"/>
+            </w:pPr>
+            <w:r>
+              <w:rPr>
+                <w:sz w:val="17"/>
+              </w:rPr>
+              <w:t>N</w:t>
+            </w:r>
+          </w:p>
+        </w:tc>
+        <w:tc>
+          <w:tcPr>
+            <w:tcW w:type="dxa" w:w="6360"/>
+            <w:tcMar>
+              <w:top w:w="80" w:type="dxa"/>
+              <w:start w:w="120" w:type="dxa"/>
+              <w:bottom w:w="80" w:type="dxa"/>
+              <w:end w:w="120" w:type="dxa"/>
+            </w:tcMar>
+            <w:vAlign w:val="center"/>
+          </w:tcPr>
+          <w:p>
+            <w:pPr>
+              <w:spacing w:after="0"/>
+            </w:pPr>
+            <w:r>
+              <w:rPr>
+                <w:sz w:val="17"/>
+              </w:rPr>
+              <w:t>Normal，普通 DVA 消息。</w:t>
+            </w:r>
+          </w:p>
+        </w:tc>
+      </w:tr>
+      <w:tr>
+        <w:tc>
+          <w:tcPr>
+            <w:tcW w:type="dxa" w:w="3000"/>
+            <w:tcMar>
+              <w:top w:w="80" w:type="dxa"/>
+              <w:start w:w="120" w:type="dxa"/>
+              <w:bottom w:w="80" w:type="dxa"/>
+              <w:end w:w="120" w:type="dxa"/>
+            </w:tcMar>
+            <w:vAlign w:val="center"/>
+          </w:tcPr>
+          <w:p>
+            <w:pPr>
+              <w:spacing w:after="0"/>
+            </w:pPr>
+            <w:r>
+              <w:rPr>
+                <w:sz w:val="17"/>
+              </w:rPr>
+              <w:t>E</w:t>
+            </w:r>
+          </w:p>
+        </w:tc>
+        <w:tc>
+          <w:tcPr>
+            <w:tcW w:type="dxa" w:w="6360"/>
+            <w:tcMar>
+              <w:top w:w="80" w:type="dxa"/>
+              <w:start w:w="120" w:type="dxa"/>
+              <w:bottom w:w="80" w:type="dxa"/>
+              <w:end w:w="120" w:type="dxa"/>
+            </w:tcMar>
+            <w:vAlign w:val="center"/>
+          </w:tcPr>
+          <w:p>
+            <w:pPr>
+              <w:spacing w:after="0"/>
+            </w:pPr>
+            <w:r>
+              <w:rPr>
+                <w:sz w:val="17"/>
+              </w:rPr>
+              <w:t>Emergency，紧急 DVA 消息。</w:t>
+            </w:r>
+          </w:p>
+        </w:tc>
+      </w:tr>
+      <w:tr>
+        <w:tc>
+          <w:tcPr>
+            <w:tcW w:type="dxa" w:w="3000"/>
+            <w:tcMar>
+              <w:top w:w="80" w:type="dxa"/>
+              <w:start w:w="120" w:type="dxa"/>
+              <w:bottom w:w="80" w:type="dxa"/>
+              <w:end w:w="120" w:type="dxa"/>
+            </w:tcMar>
+            <w:vAlign w:val="center"/>
+          </w:tcPr>
+          <w:p>
+            <w:pPr>
+              <w:spacing w:after="0"/>
+            </w:pPr>
+            <w:r>
+              <w:rPr>
+                <w:sz w:val="17"/>
+              </w:rPr>
+              <w:t>X</w:t>
+            </w:r>
+          </w:p>
+        </w:tc>
+        <w:tc>
+          <w:tcPr>
+            <w:tcW w:type="dxa" w:w="6360"/>
+            <w:tcMar>
+              <w:top w:w="80" w:type="dxa"/>
+              <w:start w:w="120" w:type="dxa"/>
+              <w:bottom w:w="80" w:type="dxa"/>
+              <w:end w:w="120" w:type="dxa"/>
+            </w:tcMar>
+            <w:vAlign w:val="center"/>
+          </w:tcPr>
+          <w:p>
+            <w:pPr>
+              <w:spacing w:after="0"/>
+            </w:pPr>
+            <w:r>
+              <w:rPr>
+                <w:sz w:val="17"/>
+              </w:rPr>
+              <w:t>Deleted，已删除/失效的消息；不可播放或加入广播。</w:t>
+            </w:r>
+          </w:p>
+        </w:tc>
+      </w:tr>
+    </w:tbl>
+    <w:p>
+      <w:pPr>
+        <w:spacing w:after="0"/>
+      </w:pPr>
+    </w:p>
+    <w:p>
+      <w:pPr>
         <w:pStyle w:val="Heading3"/>
       </w:pPr>
       <w:r>

</xml_diff>

<commit_message>
docs: describe Kafka broadcast and global states
</commit_message>
<xml_diff>
--- a/docs/PABridgeAgent_Kafka_Integration.docx
+++ b/docs/PABridgeAgent_Kafka_Integration.docx
@@ -1898,6 +1898,1921 @@
                 <w:sz w:val="17"/>
               </w:rPr>
               <w:t>是否发生错误。</w:t>
+            </w:r>
+          </w:p>
+        </w:tc>
+      </w:tr>
+    </w:tbl>
+    <w:p>
+      <w:pPr>
+        <w:spacing w:after="0"/>
+      </w:pPr>
+    </w:p>
+    <w:p>
+      <w:pPr>
+        <w:spacing w:after="100"/>
+      </w:pPr>
+      <w:r>
+        <w:t>#### broadcastState 枚举值</w:t>
+      </w:r>
+    </w:p>
+    <w:tbl>
+      <w:tblPr>
+        <w:tblStyle w:val="TableGrid"/>
+        <w:tblW w:type="dxa" w:w="9360"/>
+        <w:jc w:val="left"/>
+        <w:tblLayout w:type="fixed"/>
+        <w:tblLook w:firstColumn="1" w:firstRow="1" w:lastColumn="0" w:lastRow="0" w:noHBand="0" w:noVBand="1" w:val="04A0"/>
+        <w:tblInd w:w="120" w:type="dxa"/>
+      </w:tblPr>
+      <w:tblGrid>
+        <w:gridCol w:w="3000"/>
+        <w:gridCol w:w="6360"/>
+      </w:tblGrid>
+      <w:tr>
+        <w:tc>
+          <w:tcPr>
+            <w:tcW w:type="dxa" w:w="3000"/>
+            <w:tcMar>
+              <w:top w:w="80" w:type="dxa"/>
+              <w:start w:w="120" w:type="dxa"/>
+              <w:bottom w:w="80" w:type="dxa"/>
+              <w:end w:w="120" w:type="dxa"/>
+            </w:tcMar>
+            <w:vAlign w:val="center"/>
+            <w:shd w:fill="E8EEF5"/>
+          </w:tcPr>
+          <w:p>
+            <w:pPr>
+              <w:spacing w:after="0"/>
+            </w:pPr>
+            <w:r>
+              <w:rPr>
+                <w:b/>
+                <w:sz w:val="17"/>
+              </w:rPr>
+              <w:t>值</w:t>
+            </w:r>
+          </w:p>
+        </w:tc>
+        <w:tc>
+          <w:tcPr>
+            <w:tcW w:type="dxa" w:w="6360"/>
+            <w:tcMar>
+              <w:top w:w="80" w:type="dxa"/>
+              <w:start w:w="120" w:type="dxa"/>
+              <w:bottom w:w="80" w:type="dxa"/>
+              <w:end w:w="120" w:type="dxa"/>
+            </w:tcMar>
+            <w:vAlign w:val="center"/>
+            <w:shd w:fill="E8EEF5"/>
+          </w:tcPr>
+          <w:p>
+            <w:pPr>
+              <w:spacing w:after="0"/>
+            </w:pPr>
+            <w:r>
+              <w:rPr>
+                <w:b/>
+                <w:sz w:val="17"/>
+              </w:rPr>
+              <w:t>含义</w:t>
+            </w:r>
+          </w:p>
+        </w:tc>
+      </w:tr>
+      <w:tr>
+        <w:tc>
+          <w:tcPr>
+            <w:tcW w:type="dxa" w:w="3000"/>
+            <w:tcMar>
+              <w:top w:w="80" w:type="dxa"/>
+              <w:start w:w="120" w:type="dxa"/>
+              <w:bottom w:w="80" w:type="dxa"/>
+              <w:end w:w="120" w:type="dxa"/>
+            </w:tcMar>
+            <w:vAlign w:val="center"/>
+          </w:tcPr>
+          <w:p>
+            <w:pPr>
+              <w:spacing w:after="0"/>
+            </w:pPr>
+            <w:r>
+              <w:rPr>
+                <w:sz w:val="17"/>
+              </w:rPr>
+              <w:t>Creation</w:t>
+            </w:r>
+          </w:p>
+        </w:tc>
+        <w:tc>
+          <w:tcPr>
+            <w:tcW w:type="dxa" w:w="6360"/>
+            <w:tcMar>
+              <w:top w:w="80" w:type="dxa"/>
+              <w:start w:w="120" w:type="dxa"/>
+              <w:bottom w:w="80" w:type="dxa"/>
+              <w:end w:w="120" w:type="dxa"/>
+            </w:tcMar>
+            <w:vAlign w:val="center"/>
+          </w:tcPr>
+          <w:p>
+            <w:pPr>
+              <w:spacing w:after="0"/>
+            </w:pPr>
+            <w:r>
+              <w:rPr>
+                <w:sz w:val="17"/>
+              </w:rPr>
+              <w:t>广播已创建，处于初始化/配置阶段。</w:t>
+            </w:r>
+          </w:p>
+        </w:tc>
+      </w:tr>
+      <w:tr>
+        <w:tc>
+          <w:tcPr>
+            <w:tcW w:type="dxa" w:w="3000"/>
+            <w:tcMar>
+              <w:top w:w="80" w:type="dxa"/>
+              <w:start w:w="120" w:type="dxa"/>
+              <w:bottom w:w="80" w:type="dxa"/>
+              <w:end w:w="120" w:type="dxa"/>
+            </w:tcMar>
+            <w:vAlign w:val="center"/>
+          </w:tcPr>
+          <w:p>
+            <w:pPr>
+              <w:spacing w:after="0"/>
+            </w:pPr>
+            <w:r>
+              <w:rPr>
+                <w:sz w:val="17"/>
+              </w:rPr>
+              <w:t>Execution</w:t>
+            </w:r>
+          </w:p>
+        </w:tc>
+        <w:tc>
+          <w:tcPr>
+            <w:tcW w:type="dxa" w:w="6360"/>
+            <w:tcMar>
+              <w:top w:w="80" w:type="dxa"/>
+              <w:start w:w="120" w:type="dxa"/>
+              <w:bottom w:w="80" w:type="dxa"/>
+              <w:end w:w="120" w:type="dxa"/>
+            </w:tcMar>
+            <w:vAlign w:val="center"/>
+          </w:tcPr>
+          <w:p>
+            <w:pPr>
+              <w:spacing w:after="0"/>
+            </w:pPr>
+            <w:r>
+              <w:rPr>
+                <w:sz w:val="17"/>
+              </w:rPr>
+              <w:t>正在执行启动阶段。</w:t>
+            </w:r>
+          </w:p>
+        </w:tc>
+      </w:tr>
+      <w:tr>
+        <w:tc>
+          <w:tcPr>
+            <w:tcW w:type="dxa" w:w="3000"/>
+            <w:tcMar>
+              <w:top w:w="80" w:type="dxa"/>
+              <w:start w:w="120" w:type="dxa"/>
+              <w:bottom w:w="80" w:type="dxa"/>
+              <w:end w:w="120" w:type="dxa"/>
+            </w:tcMar>
+            <w:vAlign w:val="center"/>
+          </w:tcPr>
+          <w:p>
+            <w:pPr>
+              <w:spacing w:after="0"/>
+            </w:pPr>
+            <w:r>
+              <w:rPr>
+                <w:sz w:val="17"/>
+              </w:rPr>
+              <w:t>Runtime</w:t>
+            </w:r>
+          </w:p>
+        </w:tc>
+        <w:tc>
+          <w:tcPr>
+            <w:tcW w:type="dxa" w:w="6360"/>
+            <w:tcMar>
+              <w:top w:w="80" w:type="dxa"/>
+              <w:start w:w="120" w:type="dxa"/>
+              <w:bottom w:w="80" w:type="dxa"/>
+              <w:end w:w="120" w:type="dxa"/>
+            </w:tcMar>
+            <w:vAlign w:val="center"/>
+          </w:tcPr>
+          <w:p>
+            <w:pPr>
+              <w:spacing w:after="0"/>
+            </w:pPr>
+            <w:r>
+              <w:rPr>
+                <w:sz w:val="17"/>
+              </w:rPr>
+              <w:t>广播已进入正常运行阶段。</w:t>
+            </w:r>
+          </w:p>
+        </w:tc>
+      </w:tr>
+      <w:tr>
+        <w:tc>
+          <w:tcPr>
+            <w:tcW w:type="dxa" w:w="3000"/>
+            <w:tcMar>
+              <w:top w:w="80" w:type="dxa"/>
+              <w:start w:w="120" w:type="dxa"/>
+              <w:bottom w:w="80" w:type="dxa"/>
+              <w:end w:w="120" w:type="dxa"/>
+            </w:tcMar>
+            <w:vAlign w:val="center"/>
+          </w:tcPr>
+          <w:p>
+            <w:pPr>
+              <w:spacing w:after="0"/>
+            </w:pPr>
+            <w:r>
+              <w:rPr>
+                <w:sz w:val="17"/>
+              </w:rPr>
+              <w:t>Termination</w:t>
+            </w:r>
+          </w:p>
+        </w:tc>
+        <w:tc>
+          <w:tcPr>
+            <w:tcW w:type="dxa" w:w="6360"/>
+            <w:tcMar>
+              <w:top w:w="80" w:type="dxa"/>
+              <w:start w:w="120" w:type="dxa"/>
+              <w:bottom w:w="80" w:type="dxa"/>
+              <w:end w:w="120" w:type="dxa"/>
+            </w:tcMar>
+            <w:vAlign w:val="center"/>
+          </w:tcPr>
+          <w:p>
+            <w:pPr>
+              <w:spacing w:after="0"/>
+            </w:pPr>
+            <w:r>
+              <w:rPr>
+                <w:sz w:val="17"/>
+              </w:rPr>
+              <w:t>广播正在结束或因异常终止。</w:t>
+            </w:r>
+          </w:p>
+        </w:tc>
+      </w:tr>
+      <w:tr>
+        <w:tc>
+          <w:tcPr>
+            <w:tcW w:type="dxa" w:w="3000"/>
+            <w:tcMar>
+              <w:top w:w="80" w:type="dxa"/>
+              <w:start w:w="120" w:type="dxa"/>
+              <w:bottom w:w="80" w:type="dxa"/>
+              <w:end w:w="120" w:type="dxa"/>
+            </w:tcMar>
+            <w:vAlign w:val="center"/>
+          </w:tcPr>
+          <w:p>
+            <w:pPr>
+              <w:spacing w:after="0"/>
+            </w:pPr>
+            <w:r>
+              <w:rPr>
+                <w:sz w:val="17"/>
+              </w:rPr>
+              <w:t>PendingRemoval</w:t>
+            </w:r>
+          </w:p>
+        </w:tc>
+        <w:tc>
+          <w:tcPr>
+            <w:tcW w:type="dxa" w:w="6360"/>
+            <w:tcMar>
+              <w:top w:w="80" w:type="dxa"/>
+              <w:start w:w="120" w:type="dxa"/>
+              <w:bottom w:w="80" w:type="dxa"/>
+              <w:end w:w="120" w:type="dxa"/>
+            </w:tcMar>
+            <w:vAlign w:val="center"/>
+          </w:tcPr>
+          <w:p>
+            <w:pPr>
+              <w:spacing w:after="0"/>
+            </w:pPr>
+            <w:r>
+              <w:rPr>
+                <w:sz w:val="17"/>
+              </w:rPr>
+              <w:t>广播已结束，等待从当前广播列表移除。</w:t>
+            </w:r>
+          </w:p>
+        </w:tc>
+      </w:tr>
+    </w:tbl>
+    <w:p>
+      <w:pPr>
+        <w:spacing w:after="0"/>
+      </w:pPr>
+    </w:p>
+    <w:p>
+      <w:pPr>
+        <w:spacing w:after="100"/>
+      </w:pPr>
+      <w:r>
+        <w:t>#### globalState 枚举值</w:t>
+      </w:r>
+    </w:p>
+    <w:tbl>
+      <w:tblPr>
+        <w:tblStyle w:val="TableGrid"/>
+        <w:tblW w:type="dxa" w:w="9360"/>
+        <w:jc w:val="left"/>
+        <w:tblLayout w:type="fixed"/>
+        <w:tblLook w:firstColumn="1" w:firstRow="1" w:lastColumn="0" w:lastRow="0" w:noHBand="0" w:noVBand="1" w:val="04A0"/>
+        <w:tblInd w:w="120" w:type="dxa"/>
+      </w:tblPr>
+      <w:tblGrid>
+        <w:gridCol w:w="2200"/>
+        <w:gridCol w:w="1800"/>
+        <w:gridCol w:w="5360"/>
+      </w:tblGrid>
+      <w:tr>
+        <w:tc>
+          <w:tcPr>
+            <w:tcW w:type="dxa" w:w="2200"/>
+            <w:tcMar>
+              <w:top w:w="80" w:type="dxa"/>
+              <w:start w:w="120" w:type="dxa"/>
+              <w:bottom w:w="80" w:type="dxa"/>
+              <w:end w:w="120" w:type="dxa"/>
+            </w:tcMar>
+            <w:vAlign w:val="center"/>
+            <w:shd w:fill="E8EEF5"/>
+          </w:tcPr>
+          <w:p>
+            <w:pPr>
+              <w:spacing w:after="0"/>
+            </w:pPr>
+            <w:r>
+              <w:rPr>
+                <w:b/>
+                <w:sz w:val="17"/>
+              </w:rPr>
+              <w:t>值</w:t>
+            </w:r>
+          </w:p>
+        </w:tc>
+        <w:tc>
+          <w:tcPr>
+            <w:tcW w:type="dxa" w:w="1800"/>
+            <w:tcMar>
+              <w:top w:w="80" w:type="dxa"/>
+              <w:start w:w="120" w:type="dxa"/>
+              <w:bottom w:w="80" w:type="dxa"/>
+              <w:end w:w="120" w:type="dxa"/>
+            </w:tcMar>
+            <w:vAlign w:val="center"/>
+            <w:shd w:fill="E8EEF5"/>
+          </w:tcPr>
+          <w:p>
+            <w:pPr>
+              <w:spacing w:after="0"/>
+            </w:pPr>
+            <w:r>
+              <w:rPr>
+                <w:b/>
+                <w:sz w:val="17"/>
+              </w:rPr>
+              <w:t>枚举名</w:t>
+            </w:r>
+          </w:p>
+        </w:tc>
+        <w:tc>
+          <w:tcPr>
+            <w:tcW w:type="dxa" w:w="5360"/>
+            <w:tcMar>
+              <w:top w:w="80" w:type="dxa"/>
+              <w:start w:w="120" w:type="dxa"/>
+              <w:bottom w:w="80" w:type="dxa"/>
+              <w:end w:w="120" w:type="dxa"/>
+            </w:tcMar>
+            <w:vAlign w:val="center"/>
+            <w:shd w:fill="E8EEF5"/>
+          </w:tcPr>
+          <w:p>
+            <w:pPr>
+              <w:spacing w:after="0"/>
+            </w:pPr>
+            <w:r>
+              <w:rPr>
+                <w:b/>
+                <w:sz w:val="17"/>
+              </w:rPr>
+              <w:t>含义</w:t>
+            </w:r>
+          </w:p>
+        </w:tc>
+      </w:tr>
+      <w:tr>
+        <w:tc>
+          <w:tcPr>
+            <w:tcW w:type="dxa" w:w="2200"/>
+            <w:tcMar>
+              <w:top w:w="80" w:type="dxa"/>
+              <w:start w:w="120" w:type="dxa"/>
+              <w:bottom w:w="80" w:type="dxa"/>
+              <w:end w:w="120" w:type="dxa"/>
+            </w:tcMar>
+            <w:vAlign w:val="center"/>
+          </w:tcPr>
+          <w:p>
+            <w:pPr>
+              <w:spacing w:after="0"/>
+            </w:pPr>
+            <w:r>
+              <w:rPr>
+                <w:sz w:val="17"/>
+              </w:rPr>
+              <w:t>0</w:t>
+            </w:r>
+          </w:p>
+        </w:tc>
+        <w:tc>
+          <w:tcPr>
+            <w:tcW w:type="dxa" w:w="1800"/>
+            <w:tcMar>
+              <w:top w:w="80" w:type="dxa"/>
+              <w:start w:w="120" w:type="dxa"/>
+              <w:bottom w:w="80" w:type="dxa"/>
+              <w:end w:w="120" w:type="dxa"/>
+            </w:tcMar>
+            <w:vAlign w:val="center"/>
+          </w:tcPr>
+          <w:p>
+            <w:pPr>
+              <w:spacing w:after="0"/>
+            </w:pPr>
+            <w:r>
+              <w:rPr>
+                <w:sz w:val="17"/>
+              </w:rPr>
+              <w:t>GLOBAL_STATE_NO_FAILURE</w:t>
+            </w:r>
+          </w:p>
+        </w:tc>
+        <w:tc>
+          <w:tcPr>
+            <w:tcW w:type="dxa" w:w="5360"/>
+            <w:tcMar>
+              <w:top w:w="80" w:type="dxa"/>
+              <w:start w:w="120" w:type="dxa"/>
+              <w:bottom w:w="80" w:type="dxa"/>
+              <w:end w:w="120" w:type="dxa"/>
+            </w:tcMar>
+            <w:vAlign w:val="center"/>
+          </w:tcPr>
+          <w:p>
+            <w:pPr>
+              <w:spacing w:after="0"/>
+            </w:pPr>
+            <w:r>
+              <w:rPr>
+                <w:sz w:val="17"/>
+              </w:rPr>
+              <w:t>无全局故障。</w:t>
+            </w:r>
+          </w:p>
+        </w:tc>
+      </w:tr>
+      <w:tr>
+        <w:tc>
+          <w:tcPr>
+            <w:tcW w:type="dxa" w:w="2200"/>
+            <w:tcMar>
+              <w:top w:w="80" w:type="dxa"/>
+              <w:start w:w="120" w:type="dxa"/>
+              <w:bottom w:w="80" w:type="dxa"/>
+              <w:end w:w="120" w:type="dxa"/>
+            </w:tcMar>
+            <w:vAlign w:val="center"/>
+          </w:tcPr>
+          <w:p>
+            <w:pPr>
+              <w:spacing w:after="0"/>
+            </w:pPr>
+            <w:r>
+              <w:rPr>
+                <w:sz w:val="17"/>
+              </w:rPr>
+              <w:t>1</w:t>
+            </w:r>
+          </w:p>
+        </w:tc>
+        <w:tc>
+          <w:tcPr>
+            <w:tcW w:type="dxa" w:w="1800"/>
+            <w:tcMar>
+              <w:top w:w="80" w:type="dxa"/>
+              <w:start w:w="120" w:type="dxa"/>
+              <w:bottom w:w="80" w:type="dxa"/>
+              <w:end w:w="120" w:type="dxa"/>
+            </w:tcMar>
+            <w:vAlign w:val="center"/>
+          </w:tcPr>
+          <w:p>
+            <w:pPr>
+              <w:spacing w:after="0"/>
+            </w:pPr>
+            <w:r>
+              <w:rPr>
+                <w:sz w:val="17"/>
+              </w:rPr>
+              <w:t>GLOBAL_STATE_NO_FREE_ANNOUNCE_ID</w:t>
+            </w:r>
+          </w:p>
+        </w:tc>
+        <w:tc>
+          <w:tcPr>
+            <w:tcW w:type="dxa" w:w="5360"/>
+            <w:tcMar>
+              <w:top w:w="80" w:type="dxa"/>
+              <w:start w:w="120" w:type="dxa"/>
+              <w:bottom w:w="80" w:type="dxa"/>
+              <w:end w:w="120" w:type="dxa"/>
+            </w:tcMar>
+            <w:vAlign w:val="center"/>
+          </w:tcPr>
+          <w:p>
+            <w:pPr>
+              <w:spacing w:after="0"/>
+            </w:pPr>
+            <w:r>
+              <w:rPr>
+                <w:sz w:val="17"/>
+              </w:rPr>
+              <w:t>无可用公告 ID。</w:t>
+            </w:r>
+          </w:p>
+        </w:tc>
+      </w:tr>
+      <w:tr>
+        <w:tc>
+          <w:tcPr>
+            <w:tcW w:type="dxa" w:w="2200"/>
+            <w:tcMar>
+              <w:top w:w="80" w:type="dxa"/>
+              <w:start w:w="120" w:type="dxa"/>
+              <w:bottom w:w="80" w:type="dxa"/>
+              <w:end w:w="120" w:type="dxa"/>
+            </w:tcMar>
+            <w:vAlign w:val="center"/>
+          </w:tcPr>
+          <w:p>
+            <w:pPr>
+              <w:spacing w:after="0"/>
+            </w:pPr>
+            <w:r>
+              <w:rPr>
+                <w:sz w:val="17"/>
+              </w:rPr>
+              <w:t>2</w:t>
+            </w:r>
+          </w:p>
+        </w:tc>
+        <w:tc>
+          <w:tcPr>
+            <w:tcW w:type="dxa" w:w="1800"/>
+            <w:tcMar>
+              <w:top w:w="80" w:type="dxa"/>
+              <w:start w:w="120" w:type="dxa"/>
+              <w:bottom w:w="80" w:type="dxa"/>
+              <w:end w:w="120" w:type="dxa"/>
+            </w:tcMar>
+            <w:vAlign w:val="center"/>
+          </w:tcPr>
+          <w:p>
+            <w:pPr>
+              <w:spacing w:after="0"/>
+            </w:pPr>
+            <w:r>
+              <w:rPr>
+                <w:sz w:val="17"/>
+              </w:rPr>
+              <w:t>GLOBAL_STATE_NO_FREE_MESSAGE_SEQ_ID</w:t>
+            </w:r>
+          </w:p>
+        </w:tc>
+        <w:tc>
+          <w:tcPr>
+            <w:tcW w:type="dxa" w:w="5360"/>
+            <w:tcMar>
+              <w:top w:w="80" w:type="dxa"/>
+              <w:start w:w="120" w:type="dxa"/>
+              <w:bottom w:w="80" w:type="dxa"/>
+              <w:end w:w="120" w:type="dxa"/>
+            </w:tcMar>
+            <w:vAlign w:val="center"/>
+          </w:tcPr>
+          <w:p>
+            <w:pPr>
+              <w:spacing w:after="0"/>
+            </w:pPr>
+            <w:r>
+              <w:rPr>
+                <w:sz w:val="17"/>
+              </w:rPr>
+              <w:t>无可用消息序列 ID。</w:t>
+            </w:r>
+          </w:p>
+        </w:tc>
+      </w:tr>
+      <w:tr>
+        <w:tc>
+          <w:tcPr>
+            <w:tcW w:type="dxa" w:w="2200"/>
+            <w:tcMar>
+              <w:top w:w="80" w:type="dxa"/>
+              <w:start w:w="120" w:type="dxa"/>
+              <w:bottom w:w="80" w:type="dxa"/>
+              <w:end w:w="120" w:type="dxa"/>
+            </w:tcMar>
+            <w:vAlign w:val="center"/>
+          </w:tcPr>
+          <w:p>
+            <w:pPr>
+              <w:spacing w:after="0"/>
+            </w:pPr>
+            <w:r>
+              <w:rPr>
+                <w:sz w:val="17"/>
+              </w:rPr>
+              <w:t>3</w:t>
+            </w:r>
+          </w:p>
+        </w:tc>
+        <w:tc>
+          <w:tcPr>
+            <w:tcW w:type="dxa" w:w="1800"/>
+            <w:tcMar>
+              <w:top w:w="80" w:type="dxa"/>
+              <w:start w:w="120" w:type="dxa"/>
+              <w:bottom w:w="80" w:type="dxa"/>
+              <w:end w:w="120" w:type="dxa"/>
+            </w:tcMar>
+            <w:vAlign w:val="center"/>
+          </w:tcPr>
+          <w:p>
+            <w:pPr>
+              <w:spacing w:after="0"/>
+            </w:pPr>
+            <w:r>
+              <w:rPr>
+                <w:sz w:val="17"/>
+              </w:rPr>
+              <w:t>GLOBAL_STATE_NO_FREE_DVA_CHANNEL</w:t>
+            </w:r>
+          </w:p>
+        </w:tc>
+        <w:tc>
+          <w:tcPr>
+            <w:tcW w:type="dxa" w:w="5360"/>
+            <w:tcMar>
+              <w:top w:w="80" w:type="dxa"/>
+              <w:start w:w="120" w:type="dxa"/>
+              <w:bottom w:w="80" w:type="dxa"/>
+              <w:end w:w="120" w:type="dxa"/>
+            </w:tcMar>
+            <w:vAlign w:val="center"/>
+          </w:tcPr>
+          <w:p>
+            <w:pPr>
+              <w:spacing w:after="0"/>
+            </w:pPr>
+            <w:r>
+              <w:rPr>
+                <w:sz w:val="17"/>
+              </w:rPr>
+              <w:t>无可用 DVA 通道。</w:t>
+            </w:r>
+          </w:p>
+        </w:tc>
+      </w:tr>
+      <w:tr>
+        <w:tc>
+          <w:tcPr>
+            <w:tcW w:type="dxa" w:w="2200"/>
+            <w:tcMar>
+              <w:top w:w="80" w:type="dxa"/>
+              <w:start w:w="120" w:type="dxa"/>
+              <w:bottom w:w="80" w:type="dxa"/>
+              <w:end w:w="120" w:type="dxa"/>
+            </w:tcMar>
+            <w:vAlign w:val="center"/>
+          </w:tcPr>
+          <w:p>
+            <w:pPr>
+              <w:spacing w:after="0"/>
+            </w:pPr>
+            <w:r>
+              <w:rPr>
+                <w:sz w:val="17"/>
+              </w:rPr>
+              <w:t>4</w:t>
+            </w:r>
+          </w:p>
+        </w:tc>
+        <w:tc>
+          <w:tcPr>
+            <w:tcW w:type="dxa" w:w="1800"/>
+            <w:tcMar>
+              <w:top w:w="80" w:type="dxa"/>
+              <w:start w:w="120" w:type="dxa"/>
+              <w:bottom w:w="80" w:type="dxa"/>
+              <w:end w:w="120" w:type="dxa"/>
+            </w:tcMar>
+            <w:vAlign w:val="center"/>
+          </w:tcPr>
+          <w:p>
+            <w:pPr>
+              <w:spacing w:after="0"/>
+            </w:pPr>
+            <w:r>
+              <w:rPr>
+                <w:sz w:val="17"/>
+              </w:rPr>
+              <w:t>GLOBAL_STATE_RECORDING_SOURCE_BUSY</w:t>
+            </w:r>
+          </w:p>
+        </w:tc>
+        <w:tc>
+          <w:tcPr>
+            <w:tcW w:type="dxa" w:w="5360"/>
+            <w:tcMar>
+              <w:top w:w="80" w:type="dxa"/>
+              <w:start w:w="120" w:type="dxa"/>
+              <w:bottom w:w="80" w:type="dxa"/>
+              <w:end w:w="120" w:type="dxa"/>
+            </w:tcMar>
+            <w:vAlign w:val="center"/>
+          </w:tcPr>
+          <w:p>
+            <w:pPr>
+              <w:spacing w:after="0"/>
+            </w:pPr>
+            <w:r>
+              <w:rPr>
+                <w:sz w:val="17"/>
+              </w:rPr>
+              <w:t>录音源忙。</w:t>
+            </w:r>
+          </w:p>
+        </w:tc>
+      </w:tr>
+      <w:tr>
+        <w:tc>
+          <w:tcPr>
+            <w:tcW w:type="dxa" w:w="2200"/>
+            <w:tcMar>
+              <w:top w:w="80" w:type="dxa"/>
+              <w:start w:w="120" w:type="dxa"/>
+              <w:bottom w:w="80" w:type="dxa"/>
+              <w:end w:w="120" w:type="dxa"/>
+            </w:tcMar>
+            <w:vAlign w:val="center"/>
+          </w:tcPr>
+          <w:p>
+            <w:pPr>
+              <w:spacing w:after="0"/>
+            </w:pPr>
+            <w:r>
+              <w:rPr>
+                <w:sz w:val="17"/>
+              </w:rPr>
+              <w:t>5</w:t>
+            </w:r>
+          </w:p>
+        </w:tc>
+        <w:tc>
+          <w:tcPr>
+            <w:tcW w:type="dxa" w:w="1800"/>
+            <w:tcMar>
+              <w:top w:w="80" w:type="dxa"/>
+              <w:start w:w="120" w:type="dxa"/>
+              <w:bottom w:w="80" w:type="dxa"/>
+              <w:end w:w="120" w:type="dxa"/>
+            </w:tcMar>
+            <w:vAlign w:val="center"/>
+          </w:tcPr>
+          <w:p>
+            <w:pPr>
+              <w:spacing w:after="0"/>
+            </w:pPr>
+            <w:r>
+              <w:rPr>
+                <w:sz w:val="17"/>
+              </w:rPr>
+              <w:t>GLOBAL_STATE_MESSAGE_BUSY_RECORDING</w:t>
+            </w:r>
+          </w:p>
+        </w:tc>
+        <w:tc>
+          <w:tcPr>
+            <w:tcW w:type="dxa" w:w="5360"/>
+            <w:tcMar>
+              <w:top w:w="80" w:type="dxa"/>
+              <w:start w:w="120" w:type="dxa"/>
+              <w:bottom w:w="80" w:type="dxa"/>
+              <w:end w:w="120" w:type="dxa"/>
+            </w:tcMar>
+            <w:vAlign w:val="center"/>
+          </w:tcPr>
+          <w:p>
+            <w:pPr>
+              <w:spacing w:after="0"/>
+            </w:pPr>
+            <w:r>
+              <w:rPr>
+                <w:sz w:val="17"/>
+              </w:rPr>
+              <w:t>消息正在录制，无法使用。</w:t>
+            </w:r>
+          </w:p>
+        </w:tc>
+      </w:tr>
+      <w:tr>
+        <w:tc>
+          <w:tcPr>
+            <w:tcW w:type="dxa" w:w="2200"/>
+            <w:tcMar>
+              <w:top w:w="80" w:type="dxa"/>
+              <w:start w:w="120" w:type="dxa"/>
+              <w:bottom w:w="80" w:type="dxa"/>
+              <w:end w:w="120" w:type="dxa"/>
+            </w:tcMar>
+            <w:vAlign w:val="center"/>
+          </w:tcPr>
+          <w:p>
+            <w:pPr>
+              <w:spacing w:after="0"/>
+            </w:pPr>
+            <w:r>
+              <w:rPr>
+                <w:sz w:val="17"/>
+              </w:rPr>
+              <w:t>6</w:t>
+            </w:r>
+          </w:p>
+        </w:tc>
+        <w:tc>
+          <w:tcPr>
+            <w:tcW w:type="dxa" w:w="1800"/>
+            <w:tcMar>
+              <w:top w:w="80" w:type="dxa"/>
+              <w:start w:w="120" w:type="dxa"/>
+              <w:bottom w:w="80" w:type="dxa"/>
+              <w:end w:w="120" w:type="dxa"/>
+            </w:tcMar>
+            <w:vAlign w:val="center"/>
+          </w:tcPr>
+          <w:p>
+            <w:pPr>
+              <w:spacing w:after="0"/>
+            </w:pPr>
+            <w:r>
+              <w:rPr>
+                <w:sz w:val="17"/>
+              </w:rPr>
+              <w:t>GLOBAL_STATE_MESSAGE_BUSY_BROADCASTING</w:t>
+            </w:r>
+          </w:p>
+        </w:tc>
+        <w:tc>
+          <w:tcPr>
+            <w:tcW w:type="dxa" w:w="5360"/>
+            <w:tcMar>
+              <w:top w:w="80" w:type="dxa"/>
+              <w:start w:w="120" w:type="dxa"/>
+              <w:bottom w:w="80" w:type="dxa"/>
+              <w:end w:w="120" w:type="dxa"/>
+            </w:tcMar>
+            <w:vAlign w:val="center"/>
+          </w:tcPr>
+          <w:p>
+            <w:pPr>
+              <w:spacing w:after="0"/>
+            </w:pPr>
+            <w:r>
+              <w:rPr>
+                <w:sz w:val="17"/>
+              </w:rPr>
+              <w:t>消息正在被广播，无法使用。</w:t>
+            </w:r>
+          </w:p>
+        </w:tc>
+      </w:tr>
+      <w:tr>
+        <w:tc>
+          <w:tcPr>
+            <w:tcW w:type="dxa" w:w="2200"/>
+            <w:tcMar>
+              <w:top w:w="80" w:type="dxa"/>
+              <w:start w:w="120" w:type="dxa"/>
+              <w:bottom w:w="80" w:type="dxa"/>
+              <w:end w:w="120" w:type="dxa"/>
+            </w:tcMar>
+            <w:vAlign w:val="center"/>
+          </w:tcPr>
+          <w:p>
+            <w:pPr>
+              <w:spacing w:after="0"/>
+            </w:pPr>
+            <w:r>
+              <w:rPr>
+                <w:sz w:val="17"/>
+              </w:rPr>
+              <w:t>7</w:t>
+            </w:r>
+          </w:p>
+        </w:tc>
+        <w:tc>
+          <w:tcPr>
+            <w:tcW w:type="dxa" w:w="1800"/>
+            <w:tcMar>
+              <w:top w:w="80" w:type="dxa"/>
+              <w:start w:w="120" w:type="dxa"/>
+              <w:bottom w:w="80" w:type="dxa"/>
+              <w:end w:w="120" w:type="dxa"/>
+            </w:tcMar>
+            <w:vAlign w:val="center"/>
+          </w:tcPr>
+          <w:p>
+            <w:pPr>
+              <w:spacing w:after="0"/>
+            </w:pPr>
+            <w:r>
+              <w:rPr>
+                <w:sz w:val="17"/>
+              </w:rPr>
+              <w:t>GLOBAL_STATE_COMMS_FAILURE_TRAIN_AGENT</w:t>
+            </w:r>
+          </w:p>
+        </w:tc>
+        <w:tc>
+          <w:tcPr>
+            <w:tcW w:type="dxa" w:w="5360"/>
+            <w:tcMar>
+              <w:top w:w="80" w:type="dxa"/>
+              <w:start w:w="120" w:type="dxa"/>
+              <w:bottom w:w="80" w:type="dxa"/>
+              <w:end w:w="120" w:type="dxa"/>
+            </w:tcMar>
+            <w:vAlign w:val="center"/>
+          </w:tcPr>
+          <w:p>
+            <w:pPr>
+              <w:spacing w:after="0"/>
+            </w:pPr>
+            <w:r>
+              <w:rPr>
+                <w:sz w:val="17"/>
+              </w:rPr>
+              <w:t>与 Train Agent 通信失败。</w:t>
+            </w:r>
+          </w:p>
+        </w:tc>
+      </w:tr>
+      <w:tr>
+        <w:tc>
+          <w:tcPr>
+            <w:tcW w:type="dxa" w:w="2200"/>
+            <w:tcMar>
+              <w:top w:w="80" w:type="dxa"/>
+              <w:start w:w="120" w:type="dxa"/>
+              <w:bottom w:w="80" w:type="dxa"/>
+              <w:end w:w="120" w:type="dxa"/>
+            </w:tcMar>
+            <w:vAlign w:val="center"/>
+          </w:tcPr>
+          <w:p>
+            <w:pPr>
+              <w:spacing w:after="0"/>
+            </w:pPr>
+            <w:r>
+              <w:rPr>
+                <w:sz w:val="17"/>
+              </w:rPr>
+              <w:t>8</w:t>
+            </w:r>
+          </w:p>
+        </w:tc>
+        <w:tc>
+          <w:tcPr>
+            <w:tcW w:type="dxa" w:w="1800"/>
+            <w:tcMar>
+              <w:top w:w="80" w:type="dxa"/>
+              <w:start w:w="120" w:type="dxa"/>
+              <w:bottom w:w="80" w:type="dxa"/>
+              <w:end w:w="120" w:type="dxa"/>
+            </w:tcMar>
+            <w:vAlign w:val="center"/>
+          </w:tcPr>
+          <w:p>
+            <w:pPr>
+              <w:spacing w:after="0"/>
+            </w:pPr>
+            <w:r>
+              <w:rPr>
+                <w:sz w:val="17"/>
+              </w:rPr>
+              <w:t>GLOBAL_STATE_COMMS_FAILURE_TIS_AGENT</w:t>
+            </w:r>
+          </w:p>
+        </w:tc>
+        <w:tc>
+          <w:tcPr>
+            <w:tcW w:type="dxa" w:w="5360"/>
+            <w:tcMar>
+              <w:top w:w="80" w:type="dxa"/>
+              <w:start w:w="120" w:type="dxa"/>
+              <w:bottom w:w="80" w:type="dxa"/>
+              <w:end w:w="120" w:type="dxa"/>
+            </w:tcMar>
+            <w:vAlign w:val="center"/>
+          </w:tcPr>
+          <w:p>
+            <w:pPr>
+              <w:spacing w:after="0"/>
+            </w:pPr>
+            <w:r>
+              <w:rPr>
+                <w:sz w:val="17"/>
+              </w:rPr>
+              <w:t>与 TIS Agent 通信失败。</w:t>
+            </w:r>
+          </w:p>
+        </w:tc>
+      </w:tr>
+      <w:tr>
+        <w:tc>
+          <w:tcPr>
+            <w:tcW w:type="dxa" w:w="2200"/>
+            <w:tcMar>
+              <w:top w:w="80" w:type="dxa"/>
+              <w:start w:w="120" w:type="dxa"/>
+              <w:bottom w:w="80" w:type="dxa"/>
+              <w:end w:w="120" w:type="dxa"/>
+            </w:tcMar>
+            <w:vAlign w:val="center"/>
+          </w:tcPr>
+          <w:p>
+            <w:pPr>
+              <w:spacing w:after="0"/>
+            </w:pPr>
+            <w:r>
+              <w:rPr>
+                <w:sz w:val="17"/>
+              </w:rPr>
+              <w:t>9</w:t>
+            </w:r>
+          </w:p>
+        </w:tc>
+        <w:tc>
+          <w:tcPr>
+            <w:tcW w:type="dxa" w:w="1800"/>
+            <w:tcMar>
+              <w:top w:w="80" w:type="dxa"/>
+              <w:start w:w="120" w:type="dxa"/>
+              <w:bottom w:w="80" w:type="dxa"/>
+              <w:end w:w="120" w:type="dxa"/>
+            </w:tcMar>
+            <w:vAlign w:val="center"/>
+          </w:tcPr>
+          <w:p>
+            <w:pPr>
+              <w:spacing w:after="0"/>
+            </w:pPr>
+            <w:r>
+              <w:rPr>
+                <w:sz w:val="17"/>
+              </w:rPr>
+              <w:t>GLOBAL_STATE_COMMS_FAILURE_AUTHENTICATION_AGENT</w:t>
+            </w:r>
+          </w:p>
+        </w:tc>
+        <w:tc>
+          <w:tcPr>
+            <w:tcW w:type="dxa" w:w="5360"/>
+            <w:tcMar>
+              <w:top w:w="80" w:type="dxa"/>
+              <w:start w:w="120" w:type="dxa"/>
+              <w:bottom w:w="80" w:type="dxa"/>
+              <w:end w:w="120" w:type="dxa"/>
+            </w:tcMar>
+            <w:vAlign w:val="center"/>
+          </w:tcPr>
+          <w:p>
+            <w:pPr>
+              <w:spacing w:after="0"/>
+            </w:pPr>
+            <w:r>
+              <w:rPr>
+                <w:sz w:val="17"/>
+              </w:rPr>
+              <w:t>与认证 Agent 通信失败。</w:t>
+            </w:r>
+          </w:p>
+        </w:tc>
+      </w:tr>
+      <w:tr>
+        <w:tc>
+          <w:tcPr>
+            <w:tcW w:type="dxa" w:w="2200"/>
+            <w:tcMar>
+              <w:top w:w="80" w:type="dxa"/>
+              <w:start w:w="120" w:type="dxa"/>
+              <w:bottom w:w="80" w:type="dxa"/>
+              <w:end w:w="120" w:type="dxa"/>
+            </w:tcMar>
+            <w:vAlign w:val="center"/>
+          </w:tcPr>
+          <w:p>
+            <w:pPr>
+              <w:spacing w:after="0"/>
+            </w:pPr>
+            <w:r>
+              <w:rPr>
+                <w:sz w:val="17"/>
+              </w:rPr>
+              <w:t>10</w:t>
+            </w:r>
+          </w:p>
+        </w:tc>
+        <w:tc>
+          <w:tcPr>
+            <w:tcW w:type="dxa" w:w="1800"/>
+            <w:tcMar>
+              <w:top w:w="80" w:type="dxa"/>
+              <w:start w:w="120" w:type="dxa"/>
+              <w:bottom w:w="80" w:type="dxa"/>
+              <w:end w:w="120" w:type="dxa"/>
+            </w:tcMar>
+            <w:vAlign w:val="center"/>
+          </w:tcPr>
+          <w:p>
+            <w:pPr>
+              <w:spacing w:after="0"/>
+            </w:pPr>
+            <w:r>
+              <w:rPr>
+                <w:sz w:val="17"/>
+              </w:rPr>
+              <w:t>GLOBAL_STATE_HARDWARE_FAILURE_TRAIN_AGENT</w:t>
+            </w:r>
+          </w:p>
+        </w:tc>
+        <w:tc>
+          <w:tcPr>
+            <w:tcW w:type="dxa" w:w="5360"/>
+            <w:tcMar>
+              <w:top w:w="80" w:type="dxa"/>
+              <w:start w:w="120" w:type="dxa"/>
+              <w:bottom w:w="80" w:type="dxa"/>
+              <w:end w:w="120" w:type="dxa"/>
+            </w:tcMar>
+            <w:vAlign w:val="center"/>
+          </w:tcPr>
+          <w:p>
+            <w:pPr>
+              <w:spacing w:after="0"/>
+            </w:pPr>
+            <w:r>
+              <w:rPr>
+                <w:sz w:val="17"/>
+              </w:rPr>
+              <w:t>Train Agent 侧硬件故障。</w:t>
+            </w:r>
+          </w:p>
+        </w:tc>
+      </w:tr>
+      <w:tr>
+        <w:tc>
+          <w:tcPr>
+            <w:tcW w:type="dxa" w:w="2200"/>
+            <w:tcMar>
+              <w:top w:w="80" w:type="dxa"/>
+              <w:start w:w="120" w:type="dxa"/>
+              <w:bottom w:w="80" w:type="dxa"/>
+              <w:end w:w="120" w:type="dxa"/>
+            </w:tcMar>
+            <w:vAlign w:val="center"/>
+          </w:tcPr>
+          <w:p>
+            <w:pPr>
+              <w:spacing w:after="0"/>
+            </w:pPr>
+            <w:r>
+              <w:rPr>
+                <w:sz w:val="17"/>
+              </w:rPr>
+              <w:t>11</w:t>
+            </w:r>
+          </w:p>
+        </w:tc>
+        <w:tc>
+          <w:tcPr>
+            <w:tcW w:type="dxa" w:w="1800"/>
+            <w:tcMar>
+              <w:top w:w="80" w:type="dxa"/>
+              <w:start w:w="120" w:type="dxa"/>
+              <w:bottom w:w="80" w:type="dxa"/>
+              <w:end w:w="120" w:type="dxa"/>
+            </w:tcMar>
+            <w:vAlign w:val="center"/>
+          </w:tcPr>
+          <w:p>
+            <w:pPr>
+              <w:spacing w:after="0"/>
+            </w:pPr>
+            <w:r>
+              <w:rPr>
+                <w:sz w:val="17"/>
+              </w:rPr>
+              <w:t>GLOBAL_STATE_HARDWARE_FAILURE_TIS_AGENT</w:t>
+            </w:r>
+          </w:p>
+        </w:tc>
+        <w:tc>
+          <w:tcPr>
+            <w:tcW w:type="dxa" w:w="5360"/>
+            <w:tcMar>
+              <w:top w:w="80" w:type="dxa"/>
+              <w:start w:w="120" w:type="dxa"/>
+              <w:bottom w:w="80" w:type="dxa"/>
+              <w:end w:w="120" w:type="dxa"/>
+            </w:tcMar>
+            <w:vAlign w:val="center"/>
+          </w:tcPr>
+          <w:p>
+            <w:pPr>
+              <w:spacing w:after="0"/>
+            </w:pPr>
+            <w:r>
+              <w:rPr>
+                <w:sz w:val="17"/>
+              </w:rPr>
+              <w:t>TIS Agent 侧硬件故障。</w:t>
+            </w:r>
+          </w:p>
+        </w:tc>
+      </w:tr>
+      <w:tr>
+        <w:tc>
+          <w:tcPr>
+            <w:tcW w:type="dxa" w:w="2200"/>
+            <w:tcMar>
+              <w:top w:w="80" w:type="dxa"/>
+              <w:start w:w="120" w:type="dxa"/>
+              <w:bottom w:w="80" w:type="dxa"/>
+              <w:end w:w="120" w:type="dxa"/>
+            </w:tcMar>
+            <w:vAlign w:val="center"/>
+          </w:tcPr>
+          <w:p>
+            <w:pPr>
+              <w:spacing w:after="0"/>
+            </w:pPr>
+            <w:r>
+              <w:rPr>
+                <w:sz w:val="17"/>
+              </w:rPr>
+              <w:t>12</w:t>
+            </w:r>
+          </w:p>
+        </w:tc>
+        <w:tc>
+          <w:tcPr>
+            <w:tcW w:type="dxa" w:w="1800"/>
+            <w:tcMar>
+              <w:top w:w="80" w:type="dxa"/>
+              <w:start w:w="120" w:type="dxa"/>
+              <w:bottom w:w="80" w:type="dxa"/>
+              <w:end w:w="120" w:type="dxa"/>
+            </w:tcMar>
+            <w:vAlign w:val="center"/>
+          </w:tcPr>
+          <w:p>
+            <w:pPr>
+              <w:spacing w:after="0"/>
+            </w:pPr>
+            <w:r>
+              <w:rPr>
+                <w:sz w:val="17"/>
+              </w:rPr>
+              <w:t>GLOBAL_STATE_HARDWARE_FAILURE_PA_AGENT</w:t>
+            </w:r>
+          </w:p>
+        </w:tc>
+        <w:tc>
+          <w:tcPr>
+            <w:tcW w:type="dxa" w:w="5360"/>
+            <w:tcMar>
+              <w:top w:w="80" w:type="dxa"/>
+              <w:start w:w="120" w:type="dxa"/>
+              <w:bottom w:w="80" w:type="dxa"/>
+              <w:end w:w="120" w:type="dxa"/>
+            </w:tcMar>
+            <w:vAlign w:val="center"/>
+          </w:tcPr>
+          <w:p>
+            <w:pPr>
+              <w:spacing w:after="0"/>
+            </w:pPr>
+            <w:r>
+              <w:rPr>
+                <w:sz w:val="17"/>
+              </w:rPr>
+              <w:t>PA Agent/PAS 侧硬件故障。</w:t>
+            </w:r>
+          </w:p>
+        </w:tc>
+      </w:tr>
+      <w:tr>
+        <w:tc>
+          <w:tcPr>
+            <w:tcW w:type="dxa" w:w="2200"/>
+            <w:tcMar>
+              <w:top w:w="80" w:type="dxa"/>
+              <w:start w:w="120" w:type="dxa"/>
+              <w:bottom w:w="80" w:type="dxa"/>
+              <w:end w:w="120" w:type="dxa"/>
+            </w:tcMar>
+            <w:vAlign w:val="center"/>
+          </w:tcPr>
+          <w:p>
+            <w:pPr>
+              <w:spacing w:after="0"/>
+            </w:pPr>
+            <w:r>
+              <w:rPr>
+                <w:sz w:val="17"/>
+              </w:rPr>
+              <w:t>13</w:t>
+            </w:r>
+          </w:p>
+        </w:tc>
+        <w:tc>
+          <w:tcPr>
+            <w:tcW w:type="dxa" w:w="1800"/>
+            <w:tcMar>
+              <w:top w:w="80" w:type="dxa"/>
+              <w:start w:w="120" w:type="dxa"/>
+              <w:bottom w:w="80" w:type="dxa"/>
+              <w:end w:w="120" w:type="dxa"/>
+            </w:tcMar>
+            <w:vAlign w:val="center"/>
+          </w:tcPr>
+          <w:p>
+            <w:pPr>
+              <w:spacing w:after="0"/>
+            </w:pPr>
+            <w:r>
+              <w:rPr>
+                <w:sz w:val="17"/>
+              </w:rPr>
+              <w:t>GLOBAL_STATE_NO_PERMISSION_FAILURE_TRAIN_AGENT</w:t>
+            </w:r>
+          </w:p>
+        </w:tc>
+        <w:tc>
+          <w:tcPr>
+            <w:tcW w:type="dxa" w:w="5360"/>
+            <w:tcMar>
+              <w:top w:w="80" w:type="dxa"/>
+              <w:start w:w="120" w:type="dxa"/>
+              <w:bottom w:w="80" w:type="dxa"/>
+              <w:end w:w="120" w:type="dxa"/>
+            </w:tcMar>
+            <w:vAlign w:val="center"/>
+          </w:tcPr>
+          <w:p>
+            <w:pPr>
+              <w:spacing w:after="0"/>
+            </w:pPr>
+            <w:r>
+              <w:rPr>
+                <w:sz w:val="17"/>
+              </w:rPr>
+              <w:t>无 Train Agent 操作权限。</w:t>
+            </w:r>
+          </w:p>
+        </w:tc>
+      </w:tr>
+      <w:tr>
+        <w:tc>
+          <w:tcPr>
+            <w:tcW w:type="dxa" w:w="2200"/>
+            <w:tcMar>
+              <w:top w:w="80" w:type="dxa"/>
+              <w:start w:w="120" w:type="dxa"/>
+              <w:bottom w:w="80" w:type="dxa"/>
+              <w:end w:w="120" w:type="dxa"/>
+            </w:tcMar>
+            <w:vAlign w:val="center"/>
+          </w:tcPr>
+          <w:p>
+            <w:pPr>
+              <w:spacing w:after="0"/>
+            </w:pPr>
+            <w:r>
+              <w:rPr>
+                <w:sz w:val="17"/>
+              </w:rPr>
+              <w:t>14</w:t>
+            </w:r>
+          </w:p>
+        </w:tc>
+        <w:tc>
+          <w:tcPr>
+            <w:tcW w:type="dxa" w:w="1800"/>
+            <w:tcMar>
+              <w:top w:w="80" w:type="dxa"/>
+              <w:start w:w="120" w:type="dxa"/>
+              <w:bottom w:w="80" w:type="dxa"/>
+              <w:end w:w="120" w:type="dxa"/>
+            </w:tcMar>
+            <w:vAlign w:val="center"/>
+          </w:tcPr>
+          <w:p>
+            <w:pPr>
+              <w:spacing w:after="0"/>
+            </w:pPr>
+            <w:r>
+              <w:rPr>
+                <w:sz w:val="17"/>
+              </w:rPr>
+              <w:t>GLOBAL_STATE_NO_PERMISSION_FAILURE_TIS_AGENT</w:t>
+            </w:r>
+          </w:p>
+        </w:tc>
+        <w:tc>
+          <w:tcPr>
+            <w:tcW w:type="dxa" w:w="5360"/>
+            <w:tcMar>
+              <w:top w:w="80" w:type="dxa"/>
+              <w:start w:w="120" w:type="dxa"/>
+              <w:bottom w:w="80" w:type="dxa"/>
+              <w:end w:w="120" w:type="dxa"/>
+            </w:tcMar>
+            <w:vAlign w:val="center"/>
+          </w:tcPr>
+          <w:p>
+            <w:pPr>
+              <w:spacing w:after="0"/>
+            </w:pPr>
+            <w:r>
+              <w:rPr>
+                <w:sz w:val="17"/>
+              </w:rPr>
+              <w:t>无 TIS Agent 操作权限。</w:t>
+            </w:r>
+          </w:p>
+        </w:tc>
+      </w:tr>
+      <w:tr>
+        <w:tc>
+          <w:tcPr>
+            <w:tcW w:type="dxa" w:w="2200"/>
+            <w:tcMar>
+              <w:top w:w="80" w:type="dxa"/>
+              <w:start w:w="120" w:type="dxa"/>
+              <w:bottom w:w="80" w:type="dxa"/>
+              <w:end w:w="120" w:type="dxa"/>
+            </w:tcMar>
+            <w:vAlign w:val="center"/>
+          </w:tcPr>
+          <w:p>
+            <w:pPr>
+              <w:spacing w:after="0"/>
+            </w:pPr>
+            <w:r>
+              <w:rPr>
+                <w:sz w:val="17"/>
+              </w:rPr>
+              <w:t>15</w:t>
+            </w:r>
+          </w:p>
+        </w:tc>
+        <w:tc>
+          <w:tcPr>
+            <w:tcW w:type="dxa" w:w="1800"/>
+            <w:tcMar>
+              <w:top w:w="80" w:type="dxa"/>
+              <w:start w:w="120" w:type="dxa"/>
+              <w:bottom w:w="80" w:type="dxa"/>
+              <w:end w:w="120" w:type="dxa"/>
+            </w:tcMar>
+            <w:vAlign w:val="center"/>
+          </w:tcPr>
+          <w:p>
+            <w:pPr>
+              <w:spacing w:after="0"/>
+            </w:pPr>
+            <w:r>
+              <w:rPr>
+                <w:sz w:val="17"/>
+              </w:rPr>
+              <w:t>GLOBAL_STATE_INVALID_PROTOCOL_FAILURE_TRAIN_AGENT</w:t>
+            </w:r>
+          </w:p>
+        </w:tc>
+        <w:tc>
+          <w:tcPr>
+            <w:tcW w:type="dxa" w:w="5360"/>
+            <w:tcMar>
+              <w:top w:w="80" w:type="dxa"/>
+              <w:start w:w="120" w:type="dxa"/>
+              <w:bottom w:w="80" w:type="dxa"/>
+              <w:end w:w="120" w:type="dxa"/>
+            </w:tcMar>
+            <w:vAlign w:val="center"/>
+          </w:tcPr>
+          <w:p>
+            <w:pPr>
+              <w:spacing w:after="0"/>
+            </w:pPr>
+            <w:r>
+              <w:rPr>
+                <w:sz w:val="17"/>
+              </w:rPr>
+              <w:t>Train Agent 协议/报文无效。</w:t>
+            </w:r>
+          </w:p>
+        </w:tc>
+      </w:tr>
+      <w:tr>
+        <w:tc>
+          <w:tcPr>
+            <w:tcW w:type="dxa" w:w="2200"/>
+            <w:tcMar>
+              <w:top w:w="80" w:type="dxa"/>
+              <w:start w:w="120" w:type="dxa"/>
+              <w:bottom w:w="80" w:type="dxa"/>
+              <w:end w:w="120" w:type="dxa"/>
+            </w:tcMar>
+            <w:vAlign w:val="center"/>
+          </w:tcPr>
+          <w:p>
+            <w:pPr>
+              <w:spacing w:after="0"/>
+            </w:pPr>
+            <w:r>
+              <w:rPr>
+                <w:sz w:val="17"/>
+              </w:rPr>
+              <w:t>16</w:t>
+            </w:r>
+          </w:p>
+        </w:tc>
+        <w:tc>
+          <w:tcPr>
+            <w:tcW w:type="dxa" w:w="1800"/>
+            <w:tcMar>
+              <w:top w:w="80" w:type="dxa"/>
+              <w:start w:w="120" w:type="dxa"/>
+              <w:bottom w:w="80" w:type="dxa"/>
+              <w:end w:w="120" w:type="dxa"/>
+            </w:tcMar>
+            <w:vAlign w:val="center"/>
+          </w:tcPr>
+          <w:p>
+            <w:pPr>
+              <w:spacing w:after="0"/>
+            </w:pPr>
+            <w:r>
+              <w:rPr>
+                <w:sz w:val="17"/>
+              </w:rPr>
+              <w:t>GLOBAL_STATE_INVALID_PROTOCOL_FAILURE_TIS_AGENT</w:t>
+            </w:r>
+          </w:p>
+        </w:tc>
+        <w:tc>
+          <w:tcPr>
+            <w:tcW w:type="dxa" w:w="5360"/>
+            <w:tcMar>
+              <w:top w:w="80" w:type="dxa"/>
+              <w:start w:w="120" w:type="dxa"/>
+              <w:bottom w:w="80" w:type="dxa"/>
+              <w:end w:w="120" w:type="dxa"/>
+            </w:tcMar>
+            <w:vAlign w:val="center"/>
+          </w:tcPr>
+          <w:p>
+            <w:pPr>
+              <w:spacing w:after="0"/>
+            </w:pPr>
+            <w:r>
+              <w:rPr>
+                <w:sz w:val="17"/>
+              </w:rPr>
+              <w:t>TIS Agent 协议/报文无效。</w:t>
+            </w:r>
+          </w:p>
+        </w:tc>
+      </w:tr>
+      <w:tr>
+        <w:tc>
+          <w:tcPr>
+            <w:tcW w:type="dxa" w:w="2200"/>
+            <w:tcMar>
+              <w:top w:w="80" w:type="dxa"/>
+              <w:start w:w="120" w:type="dxa"/>
+              <w:bottom w:w="80" w:type="dxa"/>
+              <w:end w:w="120" w:type="dxa"/>
+            </w:tcMar>
+            <w:vAlign w:val="center"/>
+          </w:tcPr>
+          <w:p>
+            <w:pPr>
+              <w:spacing w:after="0"/>
+            </w:pPr>
+            <w:r>
+              <w:rPr>
+                <w:sz w:val="17"/>
+              </w:rPr>
+              <w:t>17</w:t>
+            </w:r>
+          </w:p>
+        </w:tc>
+        <w:tc>
+          <w:tcPr>
+            <w:tcW w:type="dxa" w:w="1800"/>
+            <w:tcMar>
+              <w:top w:w="80" w:type="dxa"/>
+              <w:start w:w="120" w:type="dxa"/>
+              <w:bottom w:w="80" w:type="dxa"/>
+              <w:end w:w="120" w:type="dxa"/>
+            </w:tcMar>
+            <w:vAlign w:val="center"/>
+          </w:tcPr>
+          <w:p>
+            <w:pPr>
+              <w:spacing w:after="0"/>
+            </w:pPr>
+            <w:r>
+              <w:rPr>
+                <w:sz w:val="17"/>
+              </w:rPr>
+              <w:t>GLOBAL_STATE_INVALID_PROTOCOL_FAILURE_PA_AGENT</w:t>
+            </w:r>
+          </w:p>
+        </w:tc>
+        <w:tc>
+          <w:tcPr>
+            <w:tcW w:type="dxa" w:w="5360"/>
+            <w:tcMar>
+              <w:top w:w="80" w:type="dxa"/>
+              <w:start w:w="120" w:type="dxa"/>
+              <w:bottom w:w="80" w:type="dxa"/>
+              <w:end w:w="120" w:type="dxa"/>
+            </w:tcMar>
+            <w:vAlign w:val="center"/>
+          </w:tcPr>
+          <w:p>
+            <w:pPr>
+              <w:spacing w:after="0"/>
+            </w:pPr>
+            <w:r>
+              <w:rPr>
+                <w:sz w:val="17"/>
+              </w:rPr>
+              <w:t>PA Agent/PAS 协议或报文无效。</w:t>
+            </w:r>
+          </w:p>
+        </w:tc>
+      </w:tr>
+      <w:tr>
+        <w:tc>
+          <w:tcPr>
+            <w:tcW w:type="dxa" w:w="2200"/>
+            <w:tcMar>
+              <w:top w:w="80" w:type="dxa"/>
+              <w:start w:w="120" w:type="dxa"/>
+              <w:bottom w:w="80" w:type="dxa"/>
+              <w:end w:w="120" w:type="dxa"/>
+            </w:tcMar>
+            <w:vAlign w:val="center"/>
+          </w:tcPr>
+          <w:p>
+            <w:pPr>
+              <w:spacing w:after="0"/>
+            </w:pPr>
+            <w:r>
+              <w:rPr>
+                <w:sz w:val="17"/>
+              </w:rPr>
+              <w:t>18</w:t>
+            </w:r>
+          </w:p>
+        </w:tc>
+        <w:tc>
+          <w:tcPr>
+            <w:tcW w:type="dxa" w:w="1800"/>
+            <w:tcMar>
+              <w:top w:w="80" w:type="dxa"/>
+              <w:start w:w="120" w:type="dxa"/>
+              <w:bottom w:w="80" w:type="dxa"/>
+              <w:end w:w="120" w:type="dxa"/>
+            </w:tcMar>
+            <w:vAlign w:val="center"/>
+          </w:tcPr>
+          <w:p>
+            <w:pPr>
+              <w:spacing w:after="0"/>
+            </w:pPr>
+            <w:r>
+              <w:rPr>
+                <w:sz w:val="17"/>
+              </w:rPr>
+              <w:t>GLOBAL_STATE_PUBLIC_DVA_SET_VERSION_CONFLICT</w:t>
+            </w:r>
+          </w:p>
+        </w:tc>
+        <w:tc>
+          <w:tcPr>
+            <w:tcW w:type="dxa" w:w="5360"/>
+            <w:tcMar>
+              <w:top w:w="80" w:type="dxa"/>
+              <w:start w:w="120" w:type="dxa"/>
+              <w:bottom w:w="80" w:type="dxa"/>
+              <w:end w:w="120" w:type="dxa"/>
+            </w:tcMar>
+            <w:vAlign w:val="center"/>
+          </w:tcPr>
+          <w:p>
+            <w:pPr>
+              <w:spacing w:after="0"/>
+            </w:pPr>
+            <w:r>
+              <w:rPr>
+                <w:sz w:val="17"/>
+              </w:rPr>
+              <w:t>公共 DVA 集版本冲突。</w:t>
+            </w:r>
+          </w:p>
+        </w:tc>
+      </w:tr>
+      <w:tr>
+        <w:tc>
+          <w:tcPr>
+            <w:tcW w:type="dxa" w:w="2200"/>
+            <w:tcMar>
+              <w:top w:w="80" w:type="dxa"/>
+              <w:start w:w="120" w:type="dxa"/>
+              <w:bottom w:w="80" w:type="dxa"/>
+              <w:end w:w="120" w:type="dxa"/>
+            </w:tcMar>
+            <w:vAlign w:val="center"/>
+          </w:tcPr>
+          <w:p>
+            <w:pPr>
+              <w:spacing w:after="0"/>
+            </w:pPr>
+            <w:r>
+              <w:rPr>
+                <w:sz w:val="17"/>
+              </w:rPr>
+              <w:t>19</w:t>
+            </w:r>
+          </w:p>
+        </w:tc>
+        <w:tc>
+          <w:tcPr>
+            <w:tcW w:type="dxa" w:w="1800"/>
+            <w:tcMar>
+              <w:top w:w="80" w:type="dxa"/>
+              <w:start w:w="120" w:type="dxa"/>
+              <w:bottom w:w="80" w:type="dxa"/>
+              <w:end w:w="120" w:type="dxa"/>
+            </w:tcMar>
+            <w:vAlign w:val="center"/>
+          </w:tcPr>
+          <w:p>
+            <w:pPr>
+              <w:spacing w:after="0"/>
+            </w:pPr>
+            <w:r>
+              <w:rPr>
+                <w:sz w:val="17"/>
+              </w:rPr>
+              <w:t>GLOBAL_STATE_RADIO_CALL_RESET</w:t>
+            </w:r>
+          </w:p>
+        </w:tc>
+        <w:tc>
+          <w:tcPr>
+            <w:tcW w:type="dxa" w:w="5360"/>
+            <w:tcMar>
+              <w:top w:w="80" w:type="dxa"/>
+              <w:start w:w="120" w:type="dxa"/>
+              <w:bottom w:w="80" w:type="dxa"/>
+              <w:end w:w="120" w:type="dxa"/>
+            </w:tcMar>
+            <w:vAlign w:val="center"/>
+          </w:tcPr>
+          <w:p>
+            <w:pPr>
+              <w:spacing w:after="0"/>
+            </w:pPr>
+            <w:r>
+              <w:rPr>
+                <w:sz w:val="17"/>
+              </w:rPr>
+              <w:t>列车实时广播的无线呼叫丢失/被重置。</w:t>
+            </w:r>
+          </w:p>
+        </w:tc>
+      </w:tr>
+      <w:tr>
+        <w:tc>
+          <w:tcPr>
+            <w:tcW w:type="dxa" w:w="2200"/>
+            <w:tcMar>
+              <w:top w:w="80" w:type="dxa"/>
+              <w:start w:w="120" w:type="dxa"/>
+              <w:bottom w:w="80" w:type="dxa"/>
+              <w:end w:w="120" w:type="dxa"/>
+            </w:tcMar>
+            <w:vAlign w:val="center"/>
+          </w:tcPr>
+          <w:p>
+            <w:pPr>
+              <w:spacing w:after="0"/>
+            </w:pPr>
+            <w:r>
+              <w:rPr>
+                <w:sz w:val="17"/>
+              </w:rPr>
+              <w:t>20</w:t>
+            </w:r>
+          </w:p>
+        </w:tc>
+        <w:tc>
+          <w:tcPr>
+            <w:tcW w:type="dxa" w:w="1800"/>
+            <w:tcMar>
+              <w:top w:w="80" w:type="dxa"/>
+              <w:start w:w="120" w:type="dxa"/>
+              <w:bottom w:w="80" w:type="dxa"/>
+              <w:end w:w="120" w:type="dxa"/>
+            </w:tcMar>
+            <w:vAlign w:val="center"/>
+          </w:tcPr>
+          <w:p>
+            <w:pPr>
+              <w:spacing w:after="0"/>
+            </w:pPr>
+            <w:r>
+              <w:rPr>
+                <w:sz w:val="17"/>
+              </w:rPr>
+              <w:t>GLOBAL_STATE_STATIC_GROUP_IN_USE</w:t>
+            </w:r>
+          </w:p>
+        </w:tc>
+        <w:tc>
+          <w:tcPr>
+            <w:tcW w:type="dxa" w:w="5360"/>
+            <w:tcMar>
+              <w:top w:w="80" w:type="dxa"/>
+              <w:start w:w="120" w:type="dxa"/>
+              <w:bottom w:w="80" w:type="dxa"/>
+              <w:end w:w="120" w:type="dxa"/>
+            </w:tcMar>
+            <w:vAlign w:val="center"/>
+          </w:tcPr>
+          <w:p>
+            <w:pPr>
+              <w:spacing w:after="0"/>
+            </w:pPr>
+            <w:r>
+              <w:rPr>
+                <w:sz w:val="17"/>
+              </w:rPr>
+              <w:t>静态组正在被使用。</w:t>
             </w:r>
           </w:p>
         </w:tc>

</xml_diff>